<commit_message>
Changed Heading and body font size to match the SDD Template from the Teacher.
</commit_message>
<xml_diff>
--- a/01_Standards/Milestone_2_First_Dozen_Views/Design_Description_and_Layout_Standards.docx
+++ b/01_Standards/Milestone_2_First_Dozen_Views/Design_Description_and_Layout_Standards.docx
@@ -26,7 +26,31 @@
           <w:szCs w:val="48"/>
           <w:lang w:eastAsia="en-US"/>
         </w:rPr>
-        <w:t>Numbering Scheme for CareerBound</w:t>
+        <w:t>Numbering Scheme for Career</w:t>
+      </w:r>
+      <w:r>
+        <w:rPr>
+          <w:rFonts w:ascii="Times New Roman" w:eastAsia="Times New Roman" w:hAnsi="Times New Roman" w:cs="Times New Roman"/>
+          <w:b/>
+          <w:bCs/>
+          <w:kern w:val="36"/>
+          <w:sz w:val="48"/>
+          <w:szCs w:val="48"/>
+          <w:lang w:eastAsia="en-US"/>
+        </w:rPr>
+        <w:t xml:space="preserve"> </w:t>
+      </w:r>
+      <w:r>
+        <w:rPr>
+          <w:rFonts w:ascii="Times New Roman" w:eastAsia="Times New Roman" w:hAnsi="Times New Roman" w:cs="Times New Roman"/>
+          <w:b/>
+          <w:bCs/>
+          <w:kern w:val="36"/>
+          <w:sz w:val="48"/>
+          <w:szCs w:val="48"/>
+          <w:lang w:eastAsia="en-US"/>
+        </w:rPr>
+        <w:t>Bound</w:t>
       </w:r>
     </w:p>
     <w:p>
@@ -303,7 +327,15 @@
           <w:rFonts w:ascii="Times New Roman" w:eastAsia="Times New Roman" w:hAnsi="Times New Roman" w:cs="Times New Roman"/>
           <w:lang w:eastAsia="en-US"/>
         </w:rPr>
-        <w:t xml:space="preserve">3.1 Company Dashboard </w:t>
+        <w:t xml:space="preserve">3.1 Company </w:t>
+      </w:r>
+      <w:proofErr w:type="gramStart"/>
+      <w:r>
+        <w:rPr>
+          <w:rFonts w:ascii="Times New Roman" w:eastAsia="Times New Roman" w:hAnsi="Times New Roman" w:cs="Times New Roman"/>
+          <w:lang w:eastAsia="en-US"/>
+        </w:rPr>
+        <w:t xml:space="preserve">Dashboard </w:t>
       </w:r>
       <w:r>
         <w:rPr>
@@ -313,7 +345,11 @@
         <w:t xml:space="preserve"> </w:t>
       </w:r>
       <w:r>
-        <w:t>— Team 7 (Marco Quintero)</w:t>
+        <w:t>—</w:t>
+      </w:r>
+      <w:proofErr w:type="gramEnd"/>
+      <w:r>
+        <w:t xml:space="preserve"> Team 7 (Marco Quintero)</w:t>
       </w:r>
     </w:p>
     <w:p>
@@ -634,7 +670,7 @@
           <w:lang w:eastAsia="en-US"/>
         </w:rPr>
         <w:pict w14:anchorId="5AED4702">
-          <v:rect id="_x0000_i1036" style="width:0;height:1.5pt" o:hralign="center" o:hrstd="t" o:hr="t" fillcolor="#a0a0a0" stroked="f"/>
+          <v:rect id="_x0000_i1025" style="width:0;height:1.5pt" o:hralign="center" o:hrstd="t" o:hr="t" fillcolor="#a0a0a0" stroked="f"/>
         </w:pict>
       </w:r>
       <w:r>
@@ -642,14 +678,7 @@
           <w:rFonts w:ascii="Times New Roman" w:eastAsia="Times New Roman" w:hAnsi="Times New Roman" w:cs="Times New Roman"/>
           <w:lang w:eastAsia="en-US"/>
         </w:rPr>
-        <w:t xml:space="preserve"> </w:t>
-      </w:r>
-      <w:r>
-        <w:rPr>
-          <w:rFonts w:ascii="Times New Roman" w:eastAsia="Times New Roman" w:hAnsi="Times New Roman" w:cs="Times New Roman"/>
-          <w:lang w:eastAsia="en-US"/>
-        </w:rPr>
-        <w:t>For each view page in the SDD, you w</w:t>
+        <w:t xml:space="preserve"> For each view page in the SDD, you w</w:t>
       </w:r>
       <w:r>
         <w:rPr>
@@ -812,7 +841,7 @@
           <w:lang w:eastAsia="en-US"/>
         </w:rPr>
         <w:pict w14:anchorId="3AE2AEA7">
-          <v:rect id="_x0000_i1053" style="width:0;height:1.5pt" o:hralign="center" o:hrstd="t" o:hr="t" fillcolor="#a0a0a0" stroked="f"/>
+          <v:rect id="_x0000_i1026" style="width:0;height:1.5pt" o:hralign="center" o:hrstd="t" o:hr="t" fillcolor="#a0a0a0" stroked="f"/>
         </w:pict>
       </w:r>
     </w:p>
@@ -939,17 +968,41 @@
           <w:szCs w:val="32"/>
           <w:lang w:eastAsia="en-US"/>
         </w:rPr>
-        <w:t>(Arial Bold 16 pt)</w:t>
-      </w:r>
-    </w:p>
-    <w:p>
-      <w:pPr>
-        <w:spacing w:line="240" w:lineRule="auto"/>
-        <w:outlineLvl w:val="1"/>
+        <w:t>(Arial Bold 1</w:t>
+      </w:r>
+      <w:r>
         <w:rPr>
           <w:rFonts w:ascii="Arial" w:eastAsia="Times New Roman" w:hAnsi="Arial" w:cs="Arial"/>
           <w:i/>
           <w:iCs/>
+          <w:kern w:val="36"/>
+          <w:sz w:val="32"/>
+          <w:szCs w:val="32"/>
+          <w:lang w:eastAsia="en-US"/>
+        </w:rPr>
+        <w:t>4</w:t>
+      </w:r>
+      <w:r>
+        <w:rPr>
+          <w:rFonts w:ascii="Arial" w:eastAsia="Times New Roman" w:hAnsi="Arial" w:cs="Arial"/>
+          <w:i/>
+          <w:iCs/>
+          <w:kern w:val="36"/>
+          <w:sz w:val="32"/>
+          <w:szCs w:val="32"/>
+          <w:lang w:eastAsia="en-US"/>
+        </w:rPr>
+        <w:t xml:space="preserve"> pt)</w:t>
+      </w:r>
+    </w:p>
+    <w:p>
+      <w:pPr>
+        <w:spacing w:line="240" w:lineRule="auto"/>
+        <w:outlineLvl w:val="1"/>
+        <w:rPr>
+          <w:rFonts w:ascii="Arial" w:eastAsia="Times New Roman" w:hAnsi="Arial" w:cs="Arial"/>
+          <w:i/>
+          <w:iCs/>
           <w:lang w:eastAsia="en-US"/>
         </w:rPr>
       </w:pPr>
@@ -978,16 +1031,7 @@
           <w:iCs/>
           <w:lang w:eastAsia="en-US"/>
         </w:rPr>
-        <w:t>(</w:t>
-      </w:r>
-      <w:r>
-        <w:rPr>
-          <w:rFonts w:ascii="Arial" w:eastAsia="Times New Roman" w:hAnsi="Arial" w:cs="Arial"/>
-          <w:i/>
-          <w:iCs/>
-          <w:lang w:eastAsia="en-US"/>
-        </w:rPr>
-        <w:t>Arial Bold 12 pt)</w:t>
+        <w:t>(Arial Bold 12 pt)</w:t>
       </w:r>
     </w:p>
     <w:p>
@@ -1406,7 +1450,21 @@
                 <w:rFonts w:ascii="Times New Roman" w:eastAsia="Times New Roman" w:hAnsi="Times New Roman" w:cs="Times New Roman"/>
                 <w:lang w:eastAsia="en-US"/>
               </w:rPr>
-              <w:t>16 pt</w:t>
+              <w:t>1</w:t>
+            </w:r>
+            <w:r>
+              <w:rPr>
+                <w:rFonts w:ascii="Times New Roman" w:eastAsia="Times New Roman" w:hAnsi="Times New Roman" w:cs="Times New Roman"/>
+                <w:lang w:eastAsia="en-US"/>
+              </w:rPr>
+              <w:t>4</w:t>
+            </w:r>
+            <w:r>
+              <w:rPr>
+                <w:rFonts w:ascii="Times New Roman" w:eastAsia="Times New Roman" w:hAnsi="Times New Roman" w:cs="Times New Roman"/>
+                <w:lang w:eastAsia="en-US"/>
+              </w:rPr>
+              <w:t xml:space="preserve"> pt</w:t>
             </w:r>
           </w:p>
         </w:tc>
@@ -1654,7 +1712,21 @@
                 <w:rFonts w:ascii="Times New Roman" w:eastAsia="Times New Roman" w:hAnsi="Times New Roman" w:cs="Times New Roman"/>
                 <w:lang w:eastAsia="en-US"/>
               </w:rPr>
-              <w:t>10 pt</w:t>
+              <w:t>1</w:t>
+            </w:r>
+            <w:r>
+              <w:rPr>
+                <w:rFonts w:ascii="Times New Roman" w:eastAsia="Times New Roman" w:hAnsi="Times New Roman" w:cs="Times New Roman"/>
+                <w:lang w:eastAsia="en-US"/>
+              </w:rPr>
+              <w:t>1</w:t>
+            </w:r>
+            <w:r>
+              <w:rPr>
+                <w:rFonts w:ascii="Times New Roman" w:eastAsia="Times New Roman" w:hAnsi="Times New Roman" w:cs="Times New Roman"/>
+                <w:lang w:eastAsia="en-US"/>
+              </w:rPr>
+              <w:t xml:space="preserve"> pt</w:t>
             </w:r>
           </w:p>
         </w:tc>
@@ -1725,7 +1797,21 @@
                 <w:rFonts w:ascii="Times New Roman" w:eastAsia="Times New Roman" w:hAnsi="Times New Roman" w:cs="Times New Roman"/>
                 <w:lang w:eastAsia="en-US"/>
               </w:rPr>
-              <w:t>10 pt</w:t>
+              <w:t>1</w:t>
+            </w:r>
+            <w:r>
+              <w:rPr>
+                <w:rFonts w:ascii="Times New Roman" w:eastAsia="Times New Roman" w:hAnsi="Times New Roman" w:cs="Times New Roman"/>
+                <w:lang w:eastAsia="en-US"/>
+              </w:rPr>
+              <w:t>1</w:t>
+            </w:r>
+            <w:r>
+              <w:rPr>
+                <w:rFonts w:ascii="Times New Roman" w:eastAsia="Times New Roman" w:hAnsi="Times New Roman" w:cs="Times New Roman"/>
+                <w:lang w:eastAsia="en-US"/>
+              </w:rPr>
+              <w:t xml:space="preserve"> pt</w:t>
             </w:r>
           </w:p>
         </w:tc>
@@ -1771,7 +1857,14 @@
                 <w:rFonts w:ascii="Times New Roman" w:eastAsia="Times New Roman" w:hAnsi="Times New Roman" w:cs="Times New Roman"/>
                 <w:lang w:eastAsia="en-US"/>
               </w:rPr>
-              <w:t xml:space="preserve">Arial </w:t>
+              <w:t>Arial</w:t>
+            </w:r>
+            <w:r>
+              <w:rPr>
+                <w:rFonts w:ascii="Times New Roman" w:eastAsia="Times New Roman" w:hAnsi="Times New Roman" w:cs="Times New Roman"/>
+                <w:lang w:eastAsia="en-US"/>
+              </w:rPr>
+              <w:t xml:space="preserve"> </w:t>
             </w:r>
           </w:p>
         </w:tc>
@@ -1793,7 +1886,21 @@
                 <w:rFonts w:ascii="Times New Roman" w:eastAsia="Times New Roman" w:hAnsi="Times New Roman" w:cs="Times New Roman"/>
                 <w:lang w:eastAsia="en-US"/>
               </w:rPr>
-              <w:t>10 pt</w:t>
+              <w:t>1</w:t>
+            </w:r>
+            <w:r>
+              <w:rPr>
+                <w:rFonts w:ascii="Times New Roman" w:eastAsia="Times New Roman" w:hAnsi="Times New Roman" w:cs="Times New Roman"/>
+                <w:lang w:eastAsia="en-US"/>
+              </w:rPr>
+              <w:t>1</w:t>
+            </w:r>
+            <w:r>
+              <w:rPr>
+                <w:rFonts w:ascii="Times New Roman" w:eastAsia="Times New Roman" w:hAnsi="Times New Roman" w:cs="Times New Roman"/>
+                <w:lang w:eastAsia="en-US"/>
+              </w:rPr>
+              <w:t xml:space="preserve"> pt</w:t>
             </w:r>
           </w:p>
         </w:tc>
@@ -1895,7 +2002,23 @@
           <w:rFonts w:ascii="Times New Roman" w:eastAsia="Times New Roman" w:hAnsi="Times New Roman" w:cs="Times New Roman"/>
           <w:lang w:eastAsia="en-US"/>
         </w:rPr>
-        <w:t xml:space="preserve">Tables shall span the full document text width using </w:t>
+        <w:t xml:space="preserve">Tables shall span the full document </w:t>
+      </w:r>
+      <w:proofErr w:type="gramStart"/>
+      <w:r>
+        <w:rPr>
+          <w:rFonts w:ascii="Times New Roman" w:eastAsia="Times New Roman" w:hAnsi="Times New Roman" w:cs="Times New Roman"/>
+          <w:lang w:eastAsia="en-US"/>
+        </w:rPr>
+        <w:t>text width</w:t>
+      </w:r>
+      <w:proofErr w:type="gramEnd"/>
+      <w:r>
+        <w:rPr>
+          <w:rFonts w:ascii="Times New Roman" w:eastAsia="Times New Roman" w:hAnsi="Times New Roman" w:cs="Times New Roman"/>
+          <w:lang w:eastAsia="en-US"/>
+        </w:rPr>
+        <w:t xml:space="preserve"> using </w:t>
       </w:r>
       <w:r>
         <w:rPr>
@@ -2104,7 +2227,7 @@
           <w:lang w:eastAsia="en-US"/>
         </w:rPr>
         <w:pict w14:anchorId="6A04D585">
-          <v:rect id="_x0000_i1026" style="width:0;height:1.5pt" o:hralign="center" o:hrstd="t" o:hr="t" fillcolor="#a0a0a0" stroked="f"/>
+          <v:rect id="_x0000_i1027" style="width:0;height:1.5pt" o:hralign="center" o:hrstd="t" o:hr="t" fillcolor="#a0a0a0" stroked="f"/>
         </w:pict>
       </w:r>
     </w:p>
@@ -2253,8 +2376,8 @@
         <w:tblLook w:val="04A0" w:firstRow="1" w:lastRow="0" w:firstColumn="1" w:lastColumn="0" w:noHBand="0" w:noVBand="1"/>
       </w:tblPr>
       <w:tblGrid>
-        <w:gridCol w:w="2484"/>
-        <w:gridCol w:w="6866"/>
+        <w:gridCol w:w="3055"/>
+        <w:gridCol w:w="6295"/>
       </w:tblGrid>
       <w:tr>
         <w:trPr>
@@ -2263,7 +2386,7 @@
         <w:tc>
           <w:tcPr>
             <w:cnfStyle w:val="001000000000" w:firstRow="0" w:lastRow="0" w:firstColumn="1" w:lastColumn="0" w:oddVBand="0" w:evenVBand="0" w:oddHBand="0" w:evenHBand="0" w:firstRowFirstColumn="0" w:firstRowLastColumn="0" w:lastRowFirstColumn="0" w:lastRowLastColumn="0"/>
-            <w:tcW w:w="0" w:type="auto"/>
+            <w:tcW w:w="3055" w:type="dxa"/>
             <w:hideMark/>
           </w:tcPr>
           <w:p>
@@ -2286,7 +2409,7 @@
         </w:tc>
         <w:tc>
           <w:tcPr>
-            <w:tcW w:w="0" w:type="auto"/>
+            <w:tcW w:w="6295" w:type="dxa"/>
             <w:hideMark/>
           </w:tcPr>
           <w:p>
@@ -2316,7 +2439,7 @@
         <w:tc>
           <w:tcPr>
             <w:cnfStyle w:val="001000000000" w:firstRow="0" w:lastRow="0" w:firstColumn="1" w:lastColumn="0" w:oddVBand="0" w:evenVBand="0" w:oddHBand="0" w:evenHBand="0" w:firstRowFirstColumn="0" w:firstRowLastColumn="0" w:lastRowFirstColumn="0" w:lastRowLastColumn="0"/>
-            <w:tcW w:w="0" w:type="auto"/>
+            <w:tcW w:w="3055" w:type="dxa"/>
             <w:hideMark/>
           </w:tcPr>
           <w:p>
@@ -2324,16 +2447,14 @@
               <w:spacing w:line="240" w:lineRule="auto"/>
               <w:rPr>
                 <w:rFonts w:ascii="Arial" w:eastAsia="Times New Roman" w:hAnsi="Arial" w:cs="Arial"/>
-                <w:sz w:val="20"/>
-                <w:szCs w:val="20"/>
+                <w:sz w:val="22"/>
                 <w:lang w:eastAsia="en-US"/>
               </w:rPr>
             </w:pPr>
             <w:r>
               <w:rPr>
                 <w:rFonts w:ascii="Arial" w:eastAsia="Times New Roman" w:hAnsi="Arial" w:cs="Arial"/>
-                <w:sz w:val="20"/>
-                <w:szCs w:val="20"/>
+                <w:sz w:val="22"/>
                 <w:lang w:eastAsia="en-US"/>
               </w:rPr>
               <w:t>View Name &amp; Number</w:t>
@@ -2342,7 +2463,7 @@
         </w:tc>
         <w:tc>
           <w:tcPr>
-            <w:tcW w:w="0" w:type="auto"/>
+            <w:tcW w:w="6295" w:type="dxa"/>
             <w:hideMark/>
           </w:tcPr>
           <w:p>
@@ -2351,16 +2472,14 @@
               <w:cnfStyle w:val="000000100000" w:firstRow="0" w:lastRow="0" w:firstColumn="0" w:lastColumn="0" w:oddVBand="0" w:evenVBand="0" w:oddHBand="1" w:evenHBand="0" w:firstRowFirstColumn="0" w:firstRowLastColumn="0" w:lastRowFirstColumn="0" w:lastRowLastColumn="0"/>
               <w:rPr>
                 <w:rFonts w:ascii="Arial" w:eastAsia="Times New Roman" w:hAnsi="Arial" w:cs="Arial"/>
-                <w:sz w:val="20"/>
-                <w:szCs w:val="20"/>
+                <w:sz w:val="22"/>
                 <w:lang w:eastAsia="en-US"/>
               </w:rPr>
             </w:pPr>
             <w:r>
               <w:rPr>
                 <w:rFonts w:ascii="Arial" w:eastAsia="Times New Roman" w:hAnsi="Arial" w:cs="Arial"/>
-                <w:sz w:val="20"/>
-                <w:szCs w:val="20"/>
+                <w:sz w:val="22"/>
                 <w:lang w:eastAsia="en-US"/>
               </w:rPr>
               <w:t>Unique identifier for the view. Used to organize and reference views throughout the SDD.</w:t>
@@ -2372,7 +2491,7 @@
         <w:tc>
           <w:tcPr>
             <w:cnfStyle w:val="001000000000" w:firstRow="0" w:lastRow="0" w:firstColumn="1" w:lastColumn="0" w:oddVBand="0" w:evenVBand="0" w:oddHBand="0" w:evenHBand="0" w:firstRowFirstColumn="0" w:firstRowLastColumn="0" w:lastRowFirstColumn="0" w:lastRowLastColumn="0"/>
-            <w:tcW w:w="0" w:type="auto"/>
+            <w:tcW w:w="3055" w:type="dxa"/>
             <w:hideMark/>
           </w:tcPr>
           <w:p>
@@ -2380,16 +2499,14 @@
               <w:spacing w:line="240" w:lineRule="auto"/>
               <w:rPr>
                 <w:rFonts w:ascii="Arial" w:eastAsia="Times New Roman" w:hAnsi="Arial" w:cs="Arial"/>
-                <w:sz w:val="20"/>
-                <w:szCs w:val="20"/>
+                <w:sz w:val="22"/>
                 <w:lang w:eastAsia="en-US"/>
               </w:rPr>
             </w:pPr>
             <w:r>
               <w:rPr>
                 <w:rFonts w:ascii="Arial" w:eastAsia="Times New Roman" w:hAnsi="Arial" w:cs="Arial"/>
-                <w:sz w:val="20"/>
-                <w:szCs w:val="20"/>
+                <w:sz w:val="22"/>
                 <w:lang w:eastAsia="en-US"/>
               </w:rPr>
               <w:t>Purpose / Design Concern</w:t>
@@ -2398,7 +2515,7 @@
         </w:tc>
         <w:tc>
           <w:tcPr>
-            <w:tcW w:w="0" w:type="auto"/>
+            <w:tcW w:w="6295" w:type="dxa"/>
             <w:hideMark/>
           </w:tcPr>
           <w:p>
@@ -2407,19 +2524,45 @@
               <w:cnfStyle w:val="000000000000" w:firstRow="0" w:lastRow="0" w:firstColumn="0" w:lastColumn="0" w:oddVBand="0" w:evenVBand="0" w:oddHBand="0" w:evenHBand="0" w:firstRowFirstColumn="0" w:firstRowLastColumn="0" w:lastRowFirstColumn="0" w:lastRowLastColumn="0"/>
               <w:rPr>
                 <w:rFonts w:ascii="Arial" w:eastAsia="Times New Roman" w:hAnsi="Arial" w:cs="Arial"/>
-                <w:sz w:val="20"/>
-                <w:szCs w:val="20"/>
-                <w:lang w:eastAsia="en-US"/>
-              </w:rPr>
-            </w:pPr>
+                <w:sz w:val="22"/>
+                <w:lang w:eastAsia="en-US"/>
+              </w:rPr>
+            </w:pPr>
+            <w:proofErr w:type="gramStart"/>
             <w:r>
               <w:rPr>
                 <w:rFonts w:ascii="Arial" w:eastAsia="Times New Roman" w:hAnsi="Arial" w:cs="Arial"/>
-                <w:sz w:val="20"/>
-                <w:szCs w:val="20"/>
-                <w:lang w:eastAsia="en-US"/>
-              </w:rPr>
-              <w:t>Explains why the screen exists and what stakeholder or user concern it addresses.</w:t>
+                <w:sz w:val="22"/>
+                <w:lang w:eastAsia="en-US"/>
+              </w:rPr>
+              <w:t>Explains</w:t>
+            </w:r>
+            <w:proofErr w:type="gramEnd"/>
+            <w:r>
+              <w:rPr>
+                <w:rFonts w:ascii="Arial" w:eastAsia="Times New Roman" w:hAnsi="Arial" w:cs="Arial"/>
+                <w:sz w:val="22"/>
+                <w:lang w:eastAsia="en-US"/>
+              </w:rPr>
+              <w:t xml:space="preserve"> why the screen exists and what stakeholder or user </w:t>
+            </w:r>
+            <w:proofErr w:type="gramStart"/>
+            <w:r>
+              <w:rPr>
+                <w:rFonts w:ascii="Arial" w:eastAsia="Times New Roman" w:hAnsi="Arial" w:cs="Arial"/>
+                <w:sz w:val="22"/>
+                <w:lang w:eastAsia="en-US"/>
+              </w:rPr>
+              <w:t>concern</w:t>
+            </w:r>
+            <w:proofErr w:type="gramEnd"/>
+            <w:r>
+              <w:rPr>
+                <w:rFonts w:ascii="Arial" w:eastAsia="Times New Roman" w:hAnsi="Arial" w:cs="Arial"/>
+                <w:sz w:val="22"/>
+                <w:lang w:eastAsia="en-US"/>
+              </w:rPr>
+              <w:t xml:space="preserve"> it addresses.</w:t>
             </w:r>
           </w:p>
         </w:tc>
@@ -2431,7 +2574,7 @@
         <w:tc>
           <w:tcPr>
             <w:cnfStyle w:val="001000000000" w:firstRow="0" w:lastRow="0" w:firstColumn="1" w:lastColumn="0" w:oddVBand="0" w:evenVBand="0" w:oddHBand="0" w:evenHBand="0" w:firstRowFirstColumn="0" w:firstRowLastColumn="0" w:lastRowFirstColumn="0" w:lastRowLastColumn="0"/>
-            <w:tcW w:w="0" w:type="auto"/>
+            <w:tcW w:w="3055" w:type="dxa"/>
             <w:hideMark/>
           </w:tcPr>
           <w:p>
@@ -2439,16 +2582,14 @@
               <w:spacing w:line="240" w:lineRule="auto"/>
               <w:rPr>
                 <w:rFonts w:ascii="Arial" w:eastAsia="Times New Roman" w:hAnsi="Arial" w:cs="Arial"/>
-                <w:sz w:val="20"/>
-                <w:szCs w:val="20"/>
+                <w:sz w:val="22"/>
                 <w:lang w:eastAsia="en-US"/>
               </w:rPr>
             </w:pPr>
             <w:r>
               <w:rPr>
                 <w:rFonts w:ascii="Arial" w:eastAsia="Times New Roman" w:hAnsi="Arial" w:cs="Arial"/>
-                <w:sz w:val="20"/>
-                <w:szCs w:val="20"/>
+                <w:sz w:val="22"/>
                 <w:lang w:eastAsia="en-US"/>
               </w:rPr>
               <w:t>Description</w:t>
@@ -2457,7 +2598,7 @@
         </w:tc>
         <w:tc>
           <w:tcPr>
-            <w:tcW w:w="0" w:type="auto"/>
+            <w:tcW w:w="6295" w:type="dxa"/>
             <w:hideMark/>
           </w:tcPr>
           <w:p>
@@ -2466,16 +2607,14 @@
               <w:cnfStyle w:val="000000100000" w:firstRow="0" w:lastRow="0" w:firstColumn="0" w:lastColumn="0" w:oddVBand="0" w:evenVBand="0" w:oddHBand="1" w:evenHBand="0" w:firstRowFirstColumn="0" w:firstRowLastColumn="0" w:lastRowFirstColumn="0" w:lastRowLastColumn="0"/>
               <w:rPr>
                 <w:rFonts w:ascii="Arial" w:eastAsia="Times New Roman" w:hAnsi="Arial" w:cs="Arial"/>
-                <w:sz w:val="20"/>
-                <w:szCs w:val="20"/>
+                <w:sz w:val="22"/>
                 <w:lang w:eastAsia="en-US"/>
               </w:rPr>
             </w:pPr>
             <w:r>
               <w:rPr>
                 <w:rFonts w:ascii="Arial" w:eastAsia="Times New Roman" w:hAnsi="Arial" w:cs="Arial"/>
-                <w:sz w:val="20"/>
-                <w:szCs w:val="20"/>
+                <w:sz w:val="22"/>
                 <w:lang w:eastAsia="en-US"/>
               </w:rPr>
               <w:t>Summary of what the screen does and how it functions within the system.</w:t>
@@ -2487,7 +2626,7 @@
         <w:tc>
           <w:tcPr>
             <w:cnfStyle w:val="001000000000" w:firstRow="0" w:lastRow="0" w:firstColumn="1" w:lastColumn="0" w:oddVBand="0" w:evenVBand="0" w:oddHBand="0" w:evenHBand="0" w:firstRowFirstColumn="0" w:firstRowLastColumn="0" w:lastRowFirstColumn="0" w:lastRowLastColumn="0"/>
-            <w:tcW w:w="0" w:type="auto"/>
+            <w:tcW w:w="3055" w:type="dxa"/>
             <w:hideMark/>
           </w:tcPr>
           <w:p>
@@ -2495,16 +2634,14 @@
               <w:spacing w:line="240" w:lineRule="auto"/>
               <w:rPr>
                 <w:rFonts w:ascii="Arial" w:eastAsia="Times New Roman" w:hAnsi="Arial" w:cs="Arial"/>
-                <w:sz w:val="20"/>
-                <w:szCs w:val="20"/>
+                <w:sz w:val="22"/>
                 <w:lang w:eastAsia="en-US"/>
               </w:rPr>
             </w:pPr>
             <w:r>
               <w:rPr>
                 <w:rFonts w:ascii="Arial" w:eastAsia="Times New Roman" w:hAnsi="Arial" w:cs="Arial"/>
-                <w:sz w:val="20"/>
-                <w:szCs w:val="20"/>
+                <w:sz w:val="22"/>
                 <w:lang w:eastAsia="en-US"/>
               </w:rPr>
               <w:t>Requirements</w:t>
@@ -2513,7 +2650,7 @@
         </w:tc>
         <w:tc>
           <w:tcPr>
-            <w:tcW w:w="0" w:type="auto"/>
+            <w:tcW w:w="6295" w:type="dxa"/>
             <w:hideMark/>
           </w:tcPr>
           <w:p>
@@ -2522,16 +2659,14 @@
               <w:cnfStyle w:val="000000000000" w:firstRow="0" w:lastRow="0" w:firstColumn="0" w:lastColumn="0" w:oddVBand="0" w:evenVBand="0" w:oddHBand="0" w:evenHBand="0" w:firstRowFirstColumn="0" w:firstRowLastColumn="0" w:lastRowFirstColumn="0" w:lastRowLastColumn="0"/>
               <w:rPr>
                 <w:rFonts w:ascii="Arial" w:eastAsia="Times New Roman" w:hAnsi="Arial" w:cs="Arial"/>
-                <w:sz w:val="20"/>
-                <w:szCs w:val="20"/>
+                <w:sz w:val="22"/>
                 <w:lang w:eastAsia="en-US"/>
               </w:rPr>
             </w:pPr>
             <w:r>
               <w:rPr>
                 <w:rFonts w:ascii="Arial" w:eastAsia="Times New Roman" w:hAnsi="Arial" w:cs="Arial"/>
-                <w:sz w:val="20"/>
-                <w:szCs w:val="20"/>
+                <w:sz w:val="22"/>
                 <w:lang w:eastAsia="en-US"/>
               </w:rPr>
               <w:t>Lists the related SRS sections or requirements fulfilled by the screen.</w:t>
@@ -2546,7 +2681,7 @@
         <w:tc>
           <w:tcPr>
             <w:cnfStyle w:val="001000000000" w:firstRow="0" w:lastRow="0" w:firstColumn="1" w:lastColumn="0" w:oddVBand="0" w:evenVBand="0" w:oddHBand="0" w:evenHBand="0" w:firstRowFirstColumn="0" w:firstRowLastColumn="0" w:lastRowFirstColumn="0" w:lastRowLastColumn="0"/>
-            <w:tcW w:w="0" w:type="auto"/>
+            <w:tcW w:w="3055" w:type="dxa"/>
             <w:hideMark/>
           </w:tcPr>
           <w:p>
@@ -2554,16 +2689,14 @@
               <w:spacing w:line="240" w:lineRule="auto"/>
               <w:rPr>
                 <w:rFonts w:ascii="Arial" w:eastAsia="Times New Roman" w:hAnsi="Arial" w:cs="Arial"/>
-                <w:sz w:val="20"/>
-                <w:szCs w:val="20"/>
+                <w:sz w:val="22"/>
                 <w:lang w:eastAsia="en-US"/>
               </w:rPr>
             </w:pPr>
             <w:r>
               <w:rPr>
                 <w:rFonts w:ascii="Arial" w:eastAsia="Times New Roman" w:hAnsi="Arial" w:cs="Arial"/>
-                <w:sz w:val="20"/>
-                <w:szCs w:val="20"/>
+                <w:sz w:val="22"/>
                 <w:lang w:eastAsia="en-US"/>
               </w:rPr>
               <w:t>Elements</w:t>
@@ -2572,7 +2705,7 @@
         </w:tc>
         <w:tc>
           <w:tcPr>
-            <w:tcW w:w="0" w:type="auto"/>
+            <w:tcW w:w="6295" w:type="dxa"/>
             <w:hideMark/>
           </w:tcPr>
           <w:p>
@@ -2581,16 +2714,14 @@
               <w:cnfStyle w:val="000000100000" w:firstRow="0" w:lastRow="0" w:firstColumn="0" w:lastColumn="0" w:oddVBand="0" w:evenVBand="0" w:oddHBand="1" w:evenHBand="0" w:firstRowFirstColumn="0" w:firstRowLastColumn="0" w:lastRowFirstColumn="0" w:lastRowLastColumn="0"/>
               <w:rPr>
                 <w:rFonts w:ascii="Arial" w:eastAsia="Times New Roman" w:hAnsi="Arial" w:cs="Arial"/>
-                <w:sz w:val="20"/>
-                <w:szCs w:val="20"/>
+                <w:sz w:val="22"/>
                 <w:lang w:eastAsia="en-US"/>
               </w:rPr>
             </w:pPr>
             <w:r>
               <w:rPr>
                 <w:rFonts w:ascii="Arial" w:eastAsia="Times New Roman" w:hAnsi="Arial" w:cs="Arial"/>
-                <w:sz w:val="20"/>
-                <w:szCs w:val="20"/>
+                <w:sz w:val="22"/>
                 <w:lang w:eastAsia="en-US"/>
               </w:rPr>
               <w:t>Important UI components, controls, or major sections shown on the screen.</w:t>
@@ -2602,7 +2733,7 @@
         <w:tc>
           <w:tcPr>
             <w:cnfStyle w:val="001000000000" w:firstRow="0" w:lastRow="0" w:firstColumn="1" w:lastColumn="0" w:oddVBand="0" w:evenVBand="0" w:oddHBand="0" w:evenHBand="0" w:firstRowFirstColumn="0" w:firstRowLastColumn="0" w:lastRowFirstColumn="0" w:lastRowLastColumn="0"/>
-            <w:tcW w:w="0" w:type="auto"/>
+            <w:tcW w:w="3055" w:type="dxa"/>
             <w:hideMark/>
           </w:tcPr>
           <w:p>
@@ -2610,25 +2741,24 @@
               <w:spacing w:line="240" w:lineRule="auto"/>
               <w:rPr>
                 <w:rFonts w:ascii="Arial" w:eastAsia="Times New Roman" w:hAnsi="Arial" w:cs="Arial"/>
-                <w:sz w:val="20"/>
-                <w:szCs w:val="20"/>
+                <w:sz w:val="22"/>
                 <w:lang w:eastAsia="en-US"/>
               </w:rPr>
             </w:pPr>
             <w:r>
               <w:rPr>
                 <w:rFonts w:ascii="Arial" w:eastAsia="Times New Roman" w:hAnsi="Arial" w:cs="Arial"/>
-                <w:sz w:val="20"/>
-                <w:szCs w:val="20"/>
-                <w:lang w:eastAsia="en-US"/>
-              </w:rPr>
+                <w:sz w:val="22"/>
+                <w:lang w:eastAsia="en-US"/>
+              </w:rPr>
+              <w:lastRenderedPageBreak/>
               <w:t>Inputs</w:t>
             </w:r>
           </w:p>
         </w:tc>
         <w:tc>
           <w:tcPr>
-            <w:tcW w:w="0" w:type="auto"/>
+            <w:tcW w:w="6295" w:type="dxa"/>
             <w:hideMark/>
           </w:tcPr>
           <w:p>
@@ -2636,17 +2766,15 @@
               <w:spacing w:line="240" w:lineRule="auto"/>
               <w:cnfStyle w:val="000000000000" w:firstRow="0" w:lastRow="0" w:firstColumn="0" w:lastColumn="0" w:oddVBand="0" w:evenVBand="0" w:oddHBand="0" w:evenHBand="0" w:firstRowFirstColumn="0" w:firstRowLastColumn="0" w:lastRowFirstColumn="0" w:lastRowLastColumn="0"/>
               <w:rPr>
-                <w:rFonts w:ascii="Arial" w:eastAsia="Times New Roman" w:hAnsi="Arial" w:cs="Arial"/>
-                <w:sz w:val="20"/>
-                <w:szCs w:val="20"/>
-                <w:lang w:eastAsia="en-US"/>
-              </w:rPr>
-            </w:pPr>
-            <w:r>
-              <w:rPr>
-                <w:rFonts w:ascii="Arial" w:eastAsia="Times New Roman" w:hAnsi="Arial" w:cs="Arial"/>
-                <w:sz w:val="20"/>
-                <w:szCs w:val="20"/>
+                <w:rFonts w:ascii="Times New Roman" w:eastAsia="Times New Roman" w:hAnsi="Times New Roman" w:cs="Times New Roman"/>
+                <w:sz w:val="22"/>
+                <w:lang w:eastAsia="en-US"/>
+              </w:rPr>
+            </w:pPr>
+            <w:r>
+              <w:rPr>
+                <w:rFonts w:ascii="Times New Roman" w:eastAsia="Times New Roman" w:hAnsi="Times New Roman" w:cs="Times New Roman"/>
+                <w:sz w:val="22"/>
                 <w:lang w:eastAsia="en-US"/>
               </w:rPr>
               <w:t>Information entered or actions performed by the user.</w:t>
@@ -2661,7 +2789,7 @@
         <w:tc>
           <w:tcPr>
             <w:cnfStyle w:val="001000000000" w:firstRow="0" w:lastRow="0" w:firstColumn="1" w:lastColumn="0" w:oddVBand="0" w:evenVBand="0" w:oddHBand="0" w:evenHBand="0" w:firstRowFirstColumn="0" w:firstRowLastColumn="0" w:lastRowFirstColumn="0" w:lastRowLastColumn="0"/>
-            <w:tcW w:w="0" w:type="auto"/>
+            <w:tcW w:w="3055" w:type="dxa"/>
             <w:hideMark/>
           </w:tcPr>
           <w:p>
@@ -2669,16 +2797,14 @@
               <w:spacing w:line="240" w:lineRule="auto"/>
               <w:rPr>
                 <w:rFonts w:ascii="Arial" w:eastAsia="Times New Roman" w:hAnsi="Arial" w:cs="Arial"/>
-                <w:sz w:val="20"/>
-                <w:szCs w:val="20"/>
+                <w:sz w:val="22"/>
                 <w:lang w:eastAsia="en-US"/>
               </w:rPr>
             </w:pPr>
             <w:r>
               <w:rPr>
                 <w:rFonts w:ascii="Arial" w:eastAsia="Times New Roman" w:hAnsi="Arial" w:cs="Arial"/>
-                <w:sz w:val="20"/>
-                <w:szCs w:val="20"/>
+                <w:sz w:val="22"/>
                 <w:lang w:eastAsia="en-US"/>
               </w:rPr>
               <w:t>Outputs</w:t>
@@ -2687,7 +2813,7 @@
         </w:tc>
         <w:tc>
           <w:tcPr>
-            <w:tcW w:w="0" w:type="auto"/>
+            <w:tcW w:w="6295" w:type="dxa"/>
             <w:hideMark/>
           </w:tcPr>
           <w:p>
@@ -2695,17 +2821,15 @@
               <w:spacing w:line="240" w:lineRule="auto"/>
               <w:cnfStyle w:val="000000100000" w:firstRow="0" w:lastRow="0" w:firstColumn="0" w:lastColumn="0" w:oddVBand="0" w:evenVBand="0" w:oddHBand="1" w:evenHBand="0" w:firstRowFirstColumn="0" w:firstRowLastColumn="0" w:lastRowFirstColumn="0" w:lastRowLastColumn="0"/>
               <w:rPr>
-                <w:rFonts w:ascii="Arial" w:eastAsia="Times New Roman" w:hAnsi="Arial" w:cs="Arial"/>
-                <w:sz w:val="20"/>
-                <w:szCs w:val="20"/>
-                <w:lang w:eastAsia="en-US"/>
-              </w:rPr>
-            </w:pPr>
-            <w:r>
-              <w:rPr>
-                <w:rFonts w:ascii="Arial" w:eastAsia="Times New Roman" w:hAnsi="Arial" w:cs="Arial"/>
-                <w:sz w:val="20"/>
-                <w:szCs w:val="20"/>
+                <w:rFonts w:ascii="Times New Roman" w:eastAsia="Times New Roman" w:hAnsi="Times New Roman" w:cs="Times New Roman"/>
+                <w:sz w:val="22"/>
+                <w:lang w:eastAsia="en-US"/>
+              </w:rPr>
+            </w:pPr>
+            <w:r>
+              <w:rPr>
+                <w:rFonts w:ascii="Times New Roman" w:eastAsia="Times New Roman" w:hAnsi="Times New Roman" w:cs="Times New Roman"/>
+                <w:sz w:val="22"/>
                 <w:lang w:eastAsia="en-US"/>
               </w:rPr>
               <w:t>Information displayed or returned by the system.</w:t>
@@ -2717,7 +2841,7 @@
         <w:tc>
           <w:tcPr>
             <w:cnfStyle w:val="001000000000" w:firstRow="0" w:lastRow="0" w:firstColumn="1" w:lastColumn="0" w:oddVBand="0" w:evenVBand="0" w:oddHBand="0" w:evenHBand="0" w:firstRowFirstColumn="0" w:firstRowLastColumn="0" w:lastRowFirstColumn="0" w:lastRowLastColumn="0"/>
-            <w:tcW w:w="0" w:type="auto"/>
+            <w:tcW w:w="3055" w:type="dxa"/>
             <w:hideMark/>
           </w:tcPr>
           <w:p>
@@ -2725,16 +2849,14 @@
               <w:spacing w:line="240" w:lineRule="auto"/>
               <w:rPr>
                 <w:rFonts w:ascii="Arial" w:eastAsia="Times New Roman" w:hAnsi="Arial" w:cs="Arial"/>
-                <w:sz w:val="20"/>
-                <w:szCs w:val="20"/>
+                <w:sz w:val="22"/>
                 <w:lang w:eastAsia="en-US"/>
               </w:rPr>
             </w:pPr>
             <w:r>
               <w:rPr>
                 <w:rFonts w:ascii="Arial" w:eastAsia="Times New Roman" w:hAnsi="Arial" w:cs="Arial"/>
-                <w:sz w:val="20"/>
-                <w:szCs w:val="20"/>
+                <w:sz w:val="22"/>
                 <w:lang w:eastAsia="en-US"/>
               </w:rPr>
               <w:t>Navigation / References</w:t>
@@ -2743,7 +2865,7 @@
         </w:tc>
         <w:tc>
           <w:tcPr>
-            <w:tcW w:w="0" w:type="auto"/>
+            <w:tcW w:w="6295" w:type="dxa"/>
             <w:hideMark/>
           </w:tcPr>
           <w:p>
@@ -2751,17 +2873,15 @@
               <w:spacing w:line="240" w:lineRule="auto"/>
               <w:cnfStyle w:val="000000000000" w:firstRow="0" w:lastRow="0" w:firstColumn="0" w:lastColumn="0" w:oddVBand="0" w:evenVBand="0" w:oddHBand="0" w:evenHBand="0" w:firstRowFirstColumn="0" w:firstRowLastColumn="0" w:lastRowFirstColumn="0" w:lastRowLastColumn="0"/>
               <w:rPr>
-                <w:rFonts w:ascii="Arial" w:eastAsia="Times New Roman" w:hAnsi="Arial" w:cs="Arial"/>
-                <w:sz w:val="20"/>
-                <w:szCs w:val="20"/>
-                <w:lang w:eastAsia="en-US"/>
-              </w:rPr>
-            </w:pPr>
-            <w:r>
-              <w:rPr>
-                <w:rFonts w:ascii="Arial" w:eastAsia="Times New Roman" w:hAnsi="Arial" w:cs="Arial"/>
-                <w:sz w:val="20"/>
-                <w:szCs w:val="20"/>
+                <w:rFonts w:ascii="Times New Roman" w:eastAsia="Times New Roman" w:hAnsi="Times New Roman" w:cs="Times New Roman"/>
+                <w:sz w:val="22"/>
+                <w:lang w:eastAsia="en-US"/>
+              </w:rPr>
+            </w:pPr>
+            <w:r>
+              <w:rPr>
+                <w:rFonts w:ascii="Times New Roman" w:eastAsia="Times New Roman" w:hAnsi="Times New Roman" w:cs="Times New Roman"/>
+                <w:sz w:val="22"/>
                 <w:lang w:eastAsia="en-US"/>
               </w:rPr>
               <w:t>Related screens, destinations, or connected views within the system.</w:t>
@@ -2776,7 +2896,7 @@
         <w:tc>
           <w:tcPr>
             <w:cnfStyle w:val="001000000000" w:firstRow="0" w:lastRow="0" w:firstColumn="1" w:lastColumn="0" w:oddVBand="0" w:evenVBand="0" w:oddHBand="0" w:evenHBand="0" w:firstRowFirstColumn="0" w:firstRowLastColumn="0" w:lastRowFirstColumn="0" w:lastRowLastColumn="0"/>
-            <w:tcW w:w="0" w:type="auto"/>
+            <w:tcW w:w="3055" w:type="dxa"/>
             <w:hideMark/>
           </w:tcPr>
           <w:p>
@@ -2784,16 +2904,14 @@
               <w:spacing w:line="240" w:lineRule="auto"/>
               <w:rPr>
                 <w:rFonts w:ascii="Arial" w:eastAsia="Times New Roman" w:hAnsi="Arial" w:cs="Arial"/>
-                <w:sz w:val="20"/>
-                <w:szCs w:val="20"/>
+                <w:sz w:val="22"/>
                 <w:lang w:eastAsia="en-US"/>
               </w:rPr>
             </w:pPr>
             <w:r>
               <w:rPr>
                 <w:rFonts w:ascii="Arial" w:eastAsia="Times New Roman" w:hAnsi="Arial" w:cs="Arial"/>
-                <w:sz w:val="20"/>
-                <w:szCs w:val="20"/>
+                <w:sz w:val="22"/>
                 <w:lang w:eastAsia="en-US"/>
               </w:rPr>
               <w:t>Viewpoint</w:t>
@@ -2802,7 +2920,7 @@
         </w:tc>
         <w:tc>
           <w:tcPr>
-            <w:tcW w:w="0" w:type="auto"/>
+            <w:tcW w:w="6295" w:type="dxa"/>
             <w:hideMark/>
           </w:tcPr>
           <w:p>
@@ -2810,17 +2928,15 @@
               <w:spacing w:line="240" w:lineRule="auto"/>
               <w:cnfStyle w:val="000000100000" w:firstRow="0" w:lastRow="0" w:firstColumn="0" w:lastColumn="0" w:oddVBand="0" w:evenVBand="0" w:oddHBand="1" w:evenHBand="0" w:firstRowFirstColumn="0" w:firstRowLastColumn="0" w:lastRowFirstColumn="0" w:lastRowLastColumn="0"/>
               <w:rPr>
-                <w:rFonts w:ascii="Arial" w:eastAsia="Times New Roman" w:hAnsi="Arial" w:cs="Arial"/>
-                <w:sz w:val="20"/>
-                <w:szCs w:val="20"/>
-                <w:lang w:eastAsia="en-US"/>
-              </w:rPr>
-            </w:pPr>
-            <w:r>
-              <w:rPr>
-                <w:rFonts w:ascii="Arial" w:eastAsia="Times New Roman" w:hAnsi="Arial" w:cs="Arial"/>
-                <w:sz w:val="20"/>
-                <w:szCs w:val="20"/>
+                <w:rFonts w:ascii="Times New Roman" w:eastAsia="Times New Roman" w:hAnsi="Times New Roman" w:cs="Times New Roman"/>
+                <w:sz w:val="22"/>
+                <w:lang w:eastAsia="en-US"/>
+              </w:rPr>
+            </w:pPr>
+            <w:r>
+              <w:rPr>
+                <w:rFonts w:ascii="Times New Roman" w:eastAsia="Times New Roman" w:hAnsi="Times New Roman" w:cs="Times New Roman"/>
+                <w:sz w:val="22"/>
                 <w:lang w:eastAsia="en-US"/>
               </w:rPr>
               <w:t>The design representation or notation used for the view.</w:t>
@@ -2841,9 +2957,8 @@
           <w:rFonts w:ascii="Times New Roman" w:eastAsia="Times New Roman" w:hAnsi="Times New Roman" w:cs="Times New Roman"/>
           <w:lang w:eastAsia="en-US"/>
         </w:rPr>
-        <w:lastRenderedPageBreak/>
         <w:pict w14:anchorId="74CED09F">
-          <v:rect id="_x0000_i1057" style="width:0;height:1.5pt" o:hralign="center" o:hrstd="t" o:hr="t" fillcolor="#a0a0a0" stroked="f"/>
+          <v:rect id="_x0000_i1028" style="width:0;height:1.5pt" o:hralign="center" o:hrstd="t" o:hr="t" fillcolor="#a0a0a0" stroked="f"/>
         </w:pict>
       </w:r>
     </w:p>
@@ -2891,8 +3006,8 @@
         <w:tblLook w:val="04A0" w:firstRow="1" w:lastRow="0" w:firstColumn="1" w:lastColumn="0" w:noHBand="0" w:noVBand="1"/>
       </w:tblPr>
       <w:tblGrid>
-        <w:gridCol w:w="2991"/>
-        <w:gridCol w:w="6369"/>
+        <w:gridCol w:w="2983"/>
+        <w:gridCol w:w="6377"/>
       </w:tblGrid>
       <w:tr>
         <w:trPr>
@@ -2965,16 +3080,14 @@
               <w:spacing w:line="240" w:lineRule="auto"/>
               <w:rPr>
                 <w:rFonts w:ascii="Arial" w:eastAsia="Times New Roman" w:hAnsi="Arial" w:cs="Arial"/>
-                <w:sz w:val="20"/>
-                <w:szCs w:val="20"/>
+                <w:sz w:val="22"/>
                 <w:lang w:eastAsia="en-US"/>
               </w:rPr>
             </w:pPr>
             <w:r>
               <w:rPr>
                 <w:rFonts w:ascii="Arial" w:eastAsia="Times New Roman" w:hAnsi="Arial" w:cs="Arial"/>
-                <w:sz w:val="20"/>
-                <w:szCs w:val="20"/>
+                <w:sz w:val="22"/>
                 <w:lang w:eastAsia="en-US"/>
               </w:rPr>
               <w:t>View Name &amp; Number</w:t>
@@ -2992,16 +3105,14 @@
               <w:cnfStyle w:val="000000100000" w:firstRow="0" w:lastRow="0" w:firstColumn="0" w:lastColumn="0" w:oddVBand="0" w:evenVBand="0" w:oddHBand="1" w:evenHBand="0" w:firstRowFirstColumn="0" w:firstRowLastColumn="0" w:lastRowFirstColumn="0" w:lastRowLastColumn="0"/>
               <w:rPr>
                 <w:rFonts w:ascii="Arial" w:eastAsia="Times New Roman" w:hAnsi="Arial" w:cs="Arial"/>
-                <w:sz w:val="20"/>
-                <w:szCs w:val="20"/>
+                <w:sz w:val="22"/>
                 <w:lang w:eastAsia="en-US"/>
               </w:rPr>
             </w:pPr>
             <w:r>
               <w:rPr>
                 <w:rFonts w:ascii="Arial" w:eastAsia="Times New Roman" w:hAnsi="Arial" w:cs="Arial"/>
-                <w:sz w:val="20"/>
-                <w:szCs w:val="20"/>
+                <w:sz w:val="22"/>
                 <w:lang w:eastAsia="en-US"/>
               </w:rPr>
               <w:t>2.4 – Job Search Screen</w:t>
@@ -3021,16 +3132,14 @@
               <w:spacing w:line="240" w:lineRule="auto"/>
               <w:rPr>
                 <w:rFonts w:ascii="Arial" w:eastAsia="Times New Roman" w:hAnsi="Arial" w:cs="Arial"/>
-                <w:sz w:val="20"/>
-                <w:szCs w:val="20"/>
+                <w:sz w:val="22"/>
                 <w:lang w:eastAsia="en-US"/>
               </w:rPr>
             </w:pPr>
             <w:r>
               <w:rPr>
                 <w:rFonts w:ascii="Arial" w:eastAsia="Times New Roman" w:hAnsi="Arial" w:cs="Arial"/>
-                <w:sz w:val="20"/>
-                <w:szCs w:val="20"/>
+                <w:sz w:val="22"/>
                 <w:lang w:eastAsia="en-US"/>
               </w:rPr>
               <w:t>Purpose / Design Concern</w:t>
@@ -3048,19 +3157,27 @@
               <w:cnfStyle w:val="000000000000" w:firstRow="0" w:lastRow="0" w:firstColumn="0" w:lastColumn="0" w:oddVBand="0" w:evenVBand="0" w:oddHBand="0" w:evenHBand="0" w:firstRowFirstColumn="0" w:firstRowLastColumn="0" w:lastRowFirstColumn="0" w:lastRowLastColumn="0"/>
               <w:rPr>
                 <w:rFonts w:ascii="Arial" w:eastAsia="Times New Roman" w:hAnsi="Arial" w:cs="Arial"/>
-                <w:sz w:val="20"/>
-                <w:szCs w:val="20"/>
-                <w:lang w:eastAsia="en-US"/>
-              </w:rPr>
-            </w:pPr>
+                <w:sz w:val="22"/>
+                <w:lang w:eastAsia="en-US"/>
+              </w:rPr>
+            </w:pPr>
+            <w:proofErr w:type="gramStart"/>
             <w:r>
               <w:rPr>
                 <w:rFonts w:ascii="Arial" w:eastAsia="Times New Roman" w:hAnsi="Arial" w:cs="Arial"/>
-                <w:sz w:val="20"/>
-                <w:szCs w:val="20"/>
-                <w:lang w:eastAsia="en-US"/>
-              </w:rPr>
-              <w:t>Allows students to search for jobs and companies.</w:t>
+                <w:sz w:val="22"/>
+                <w:lang w:eastAsia="en-US"/>
+              </w:rPr>
+              <w:t>Allows</w:t>
+            </w:r>
+            <w:proofErr w:type="gramEnd"/>
+            <w:r>
+              <w:rPr>
+                <w:rFonts w:ascii="Arial" w:eastAsia="Times New Roman" w:hAnsi="Arial" w:cs="Arial"/>
+                <w:sz w:val="22"/>
+                <w:lang w:eastAsia="en-US"/>
+              </w:rPr>
+              <w:t xml:space="preserve"> students to search for jobs and companies.</w:t>
             </w:r>
           </w:p>
         </w:tc>
@@ -3080,16 +3197,14 @@
               <w:spacing w:line="240" w:lineRule="auto"/>
               <w:rPr>
                 <w:rFonts w:ascii="Arial" w:eastAsia="Times New Roman" w:hAnsi="Arial" w:cs="Arial"/>
-                <w:sz w:val="20"/>
-                <w:szCs w:val="20"/>
+                <w:sz w:val="22"/>
                 <w:lang w:eastAsia="en-US"/>
               </w:rPr>
             </w:pPr>
             <w:r>
               <w:rPr>
                 <w:rFonts w:ascii="Arial" w:eastAsia="Times New Roman" w:hAnsi="Arial" w:cs="Arial"/>
-                <w:sz w:val="20"/>
-                <w:szCs w:val="20"/>
+                <w:sz w:val="22"/>
                 <w:lang w:eastAsia="en-US"/>
               </w:rPr>
               <w:t>Description</w:t>
@@ -3107,16 +3222,14 @@
               <w:cnfStyle w:val="000000100000" w:firstRow="0" w:lastRow="0" w:firstColumn="0" w:lastColumn="0" w:oddVBand="0" w:evenVBand="0" w:oddHBand="1" w:evenHBand="0" w:firstRowFirstColumn="0" w:firstRowLastColumn="0" w:lastRowFirstColumn="0" w:lastRowLastColumn="0"/>
               <w:rPr>
                 <w:rFonts w:ascii="Arial" w:eastAsia="Times New Roman" w:hAnsi="Arial" w:cs="Arial"/>
-                <w:sz w:val="20"/>
-                <w:szCs w:val="20"/>
+                <w:sz w:val="22"/>
                 <w:lang w:eastAsia="en-US"/>
               </w:rPr>
             </w:pPr>
             <w:r>
               <w:rPr>
                 <w:rFonts w:ascii="Arial" w:eastAsia="Times New Roman" w:hAnsi="Arial" w:cs="Arial"/>
-                <w:sz w:val="20"/>
-                <w:szCs w:val="20"/>
+                <w:sz w:val="22"/>
                 <w:lang w:eastAsia="en-US"/>
               </w:rPr>
               <w:t>Displays searchable job listings with filters and detailed results.</w:t>
@@ -3136,16 +3249,14 @@
               <w:spacing w:line="240" w:lineRule="auto"/>
               <w:rPr>
                 <w:rFonts w:ascii="Arial" w:eastAsia="Times New Roman" w:hAnsi="Arial" w:cs="Arial"/>
-                <w:sz w:val="20"/>
-                <w:szCs w:val="20"/>
+                <w:sz w:val="22"/>
                 <w:lang w:eastAsia="en-US"/>
               </w:rPr>
             </w:pPr>
             <w:r>
               <w:rPr>
                 <w:rFonts w:ascii="Arial" w:eastAsia="Times New Roman" w:hAnsi="Arial" w:cs="Arial"/>
-                <w:sz w:val="20"/>
-                <w:szCs w:val="20"/>
+                <w:sz w:val="22"/>
                 <w:lang w:eastAsia="en-US"/>
               </w:rPr>
               <w:t>Requirements</w:t>
@@ -3163,16 +3274,14 @@
               <w:cnfStyle w:val="000000000000" w:firstRow="0" w:lastRow="0" w:firstColumn="0" w:lastColumn="0" w:oddVBand="0" w:evenVBand="0" w:oddHBand="0" w:evenHBand="0" w:firstRowFirstColumn="0" w:firstRowLastColumn="0" w:lastRowFirstColumn="0" w:lastRowLastColumn="0"/>
               <w:rPr>
                 <w:rFonts w:ascii="Arial" w:eastAsia="Times New Roman" w:hAnsi="Arial" w:cs="Arial"/>
-                <w:sz w:val="20"/>
-                <w:szCs w:val="20"/>
+                <w:sz w:val="22"/>
                 <w:lang w:eastAsia="en-US"/>
               </w:rPr>
             </w:pPr>
             <w:r>
               <w:rPr>
                 <w:rFonts w:ascii="Arial" w:eastAsia="Times New Roman" w:hAnsi="Arial" w:cs="Arial"/>
-                <w:sz w:val="20"/>
-                <w:szCs w:val="20"/>
+                <w:sz w:val="22"/>
                 <w:lang w:eastAsia="en-US"/>
               </w:rPr>
               <w:t>SRS 2.3 Search Features, 3.3 Student Search Features</w:t>
@@ -3195,16 +3304,14 @@
               <w:spacing w:line="240" w:lineRule="auto"/>
               <w:rPr>
                 <w:rFonts w:ascii="Arial" w:eastAsia="Times New Roman" w:hAnsi="Arial" w:cs="Arial"/>
-                <w:sz w:val="20"/>
-                <w:szCs w:val="20"/>
+                <w:sz w:val="22"/>
                 <w:lang w:eastAsia="en-US"/>
               </w:rPr>
             </w:pPr>
             <w:r>
               <w:rPr>
                 <w:rFonts w:ascii="Arial" w:eastAsia="Times New Roman" w:hAnsi="Arial" w:cs="Arial"/>
-                <w:sz w:val="20"/>
-                <w:szCs w:val="20"/>
+                <w:sz w:val="22"/>
                 <w:lang w:eastAsia="en-US"/>
               </w:rPr>
               <w:t>Elements</w:t>
@@ -3222,16 +3329,14 @@
               <w:cnfStyle w:val="000000100000" w:firstRow="0" w:lastRow="0" w:firstColumn="0" w:lastColumn="0" w:oddVBand="0" w:evenVBand="0" w:oddHBand="1" w:evenHBand="0" w:firstRowFirstColumn="0" w:firstRowLastColumn="0" w:lastRowFirstColumn="0" w:lastRowLastColumn="0"/>
               <w:rPr>
                 <w:rFonts w:ascii="Arial" w:eastAsia="Times New Roman" w:hAnsi="Arial" w:cs="Arial"/>
-                <w:sz w:val="20"/>
-                <w:szCs w:val="20"/>
+                <w:sz w:val="22"/>
                 <w:lang w:eastAsia="en-US"/>
               </w:rPr>
             </w:pPr>
             <w:r>
               <w:rPr>
                 <w:rFonts w:ascii="Arial" w:eastAsia="Times New Roman" w:hAnsi="Arial" w:cs="Arial"/>
-                <w:sz w:val="20"/>
-                <w:szCs w:val="20"/>
+                <w:sz w:val="22"/>
                 <w:lang w:eastAsia="en-US"/>
               </w:rPr>
               <w:t>Search bar, filters, results list, pagination, save/apply buttons</w:t>
@@ -3251,16 +3356,14 @@
               <w:spacing w:line="240" w:lineRule="auto"/>
               <w:rPr>
                 <w:rFonts w:ascii="Arial" w:eastAsia="Times New Roman" w:hAnsi="Arial" w:cs="Arial"/>
-                <w:sz w:val="20"/>
-                <w:szCs w:val="20"/>
+                <w:sz w:val="22"/>
                 <w:lang w:eastAsia="en-US"/>
               </w:rPr>
             </w:pPr>
             <w:r>
               <w:rPr>
                 <w:rFonts w:ascii="Arial" w:eastAsia="Times New Roman" w:hAnsi="Arial" w:cs="Arial"/>
-                <w:sz w:val="20"/>
-                <w:szCs w:val="20"/>
+                <w:sz w:val="22"/>
                 <w:lang w:eastAsia="en-US"/>
               </w:rPr>
               <w:t>Inputs</w:t>
@@ -3278,16 +3381,14 @@
               <w:cnfStyle w:val="000000000000" w:firstRow="0" w:lastRow="0" w:firstColumn="0" w:lastColumn="0" w:oddVBand="0" w:evenVBand="0" w:oddHBand="0" w:evenHBand="0" w:firstRowFirstColumn="0" w:firstRowLastColumn="0" w:lastRowFirstColumn="0" w:lastRowLastColumn="0"/>
               <w:rPr>
                 <w:rFonts w:ascii="Arial" w:eastAsia="Times New Roman" w:hAnsi="Arial" w:cs="Arial"/>
-                <w:sz w:val="20"/>
-                <w:szCs w:val="20"/>
+                <w:sz w:val="22"/>
                 <w:lang w:eastAsia="en-US"/>
               </w:rPr>
             </w:pPr>
             <w:r>
               <w:rPr>
                 <w:rFonts w:ascii="Arial" w:eastAsia="Times New Roman" w:hAnsi="Arial" w:cs="Arial"/>
-                <w:sz w:val="20"/>
-                <w:szCs w:val="20"/>
+                <w:sz w:val="22"/>
                 <w:lang w:eastAsia="en-US"/>
               </w:rPr>
               <w:t>Search terms, filter selections, wildcard search</w:t>
@@ -3310,16 +3411,14 @@
               <w:spacing w:line="240" w:lineRule="auto"/>
               <w:rPr>
                 <w:rFonts w:ascii="Arial" w:eastAsia="Times New Roman" w:hAnsi="Arial" w:cs="Arial"/>
-                <w:sz w:val="20"/>
-                <w:szCs w:val="20"/>
+                <w:sz w:val="22"/>
                 <w:lang w:eastAsia="en-US"/>
               </w:rPr>
             </w:pPr>
             <w:r>
               <w:rPr>
                 <w:rFonts w:ascii="Arial" w:eastAsia="Times New Roman" w:hAnsi="Arial" w:cs="Arial"/>
-                <w:sz w:val="20"/>
-                <w:szCs w:val="20"/>
+                <w:sz w:val="22"/>
                 <w:lang w:eastAsia="en-US"/>
               </w:rPr>
               <w:t>Outputs</w:t>
@@ -3337,16 +3436,14 @@
               <w:cnfStyle w:val="000000100000" w:firstRow="0" w:lastRow="0" w:firstColumn="0" w:lastColumn="0" w:oddVBand="0" w:evenVBand="0" w:oddHBand="1" w:evenHBand="0" w:firstRowFirstColumn="0" w:firstRowLastColumn="0" w:lastRowFirstColumn="0" w:lastRowLastColumn="0"/>
               <w:rPr>
                 <w:rFonts w:ascii="Arial" w:eastAsia="Times New Roman" w:hAnsi="Arial" w:cs="Arial"/>
-                <w:sz w:val="20"/>
-                <w:szCs w:val="20"/>
+                <w:sz w:val="22"/>
                 <w:lang w:eastAsia="en-US"/>
               </w:rPr>
             </w:pPr>
             <w:r>
               <w:rPr>
                 <w:rFonts w:ascii="Arial" w:eastAsia="Times New Roman" w:hAnsi="Arial" w:cs="Arial"/>
-                <w:sz w:val="20"/>
-                <w:szCs w:val="20"/>
+                <w:sz w:val="22"/>
                 <w:lang w:eastAsia="en-US"/>
               </w:rPr>
               <w:t>Matching job postings and company search results</w:t>
@@ -3366,16 +3463,14 @@
               <w:spacing w:line="240" w:lineRule="auto"/>
               <w:rPr>
                 <w:rFonts w:ascii="Arial" w:eastAsia="Times New Roman" w:hAnsi="Arial" w:cs="Arial"/>
-                <w:sz w:val="20"/>
-                <w:szCs w:val="20"/>
+                <w:sz w:val="22"/>
                 <w:lang w:eastAsia="en-US"/>
               </w:rPr>
             </w:pPr>
             <w:r>
               <w:rPr>
                 <w:rFonts w:ascii="Arial" w:eastAsia="Times New Roman" w:hAnsi="Arial" w:cs="Arial"/>
-                <w:sz w:val="20"/>
-                <w:szCs w:val="20"/>
+                <w:sz w:val="22"/>
                 <w:lang w:eastAsia="en-US"/>
               </w:rPr>
               <w:t>Navigation / References</w:t>
@@ -3393,16 +3488,14 @@
               <w:cnfStyle w:val="000000000000" w:firstRow="0" w:lastRow="0" w:firstColumn="0" w:lastColumn="0" w:oddVBand="0" w:evenVBand="0" w:oddHBand="0" w:evenHBand="0" w:firstRowFirstColumn="0" w:firstRowLastColumn="0" w:lastRowFirstColumn="0" w:lastRowLastColumn="0"/>
               <w:rPr>
                 <w:rFonts w:ascii="Arial" w:eastAsia="Times New Roman" w:hAnsi="Arial" w:cs="Arial"/>
-                <w:sz w:val="20"/>
-                <w:szCs w:val="20"/>
+                <w:sz w:val="22"/>
                 <w:lang w:eastAsia="en-US"/>
               </w:rPr>
             </w:pPr>
             <w:r>
               <w:rPr>
                 <w:rFonts w:ascii="Arial" w:eastAsia="Times New Roman" w:hAnsi="Arial" w:cs="Arial"/>
-                <w:sz w:val="20"/>
-                <w:szCs w:val="20"/>
+                <w:sz w:val="22"/>
                 <w:lang w:eastAsia="en-US"/>
               </w:rPr>
               <w:t>Job Details Screen, Company Profile, Student Dashboard</w:t>
@@ -3425,16 +3518,14 @@
               <w:spacing w:line="240" w:lineRule="auto"/>
               <w:rPr>
                 <w:rFonts w:ascii="Arial" w:eastAsia="Times New Roman" w:hAnsi="Arial" w:cs="Arial"/>
-                <w:sz w:val="20"/>
-                <w:szCs w:val="20"/>
+                <w:sz w:val="22"/>
                 <w:lang w:eastAsia="en-US"/>
               </w:rPr>
             </w:pPr>
             <w:r>
               <w:rPr>
                 <w:rFonts w:ascii="Arial" w:eastAsia="Times New Roman" w:hAnsi="Arial" w:cs="Arial"/>
-                <w:sz w:val="20"/>
-                <w:szCs w:val="20"/>
+                <w:sz w:val="22"/>
                 <w:lang w:eastAsia="en-US"/>
               </w:rPr>
               <w:t>Viewpoint</w:t>
@@ -3452,16 +3543,14 @@
               <w:cnfStyle w:val="000000100000" w:firstRow="0" w:lastRow="0" w:firstColumn="0" w:lastColumn="0" w:oddVBand="0" w:evenVBand="0" w:oddHBand="1" w:evenHBand="0" w:firstRowFirstColumn="0" w:firstRowLastColumn="0" w:lastRowFirstColumn="0" w:lastRowLastColumn="0"/>
               <w:rPr>
                 <w:rFonts w:ascii="Arial" w:eastAsia="Times New Roman" w:hAnsi="Arial" w:cs="Arial"/>
-                <w:sz w:val="20"/>
-                <w:szCs w:val="20"/>
+                <w:sz w:val="22"/>
                 <w:lang w:eastAsia="en-US"/>
               </w:rPr>
             </w:pPr>
             <w:r>
               <w:rPr>
                 <w:rFonts w:ascii="Arial" w:eastAsia="Times New Roman" w:hAnsi="Arial" w:cs="Arial"/>
-                <w:sz w:val="20"/>
-                <w:szCs w:val="20"/>
+                <w:sz w:val="22"/>
                 <w:lang w:eastAsia="en-US"/>
               </w:rPr>
               <w:t>UI Wireframe / Mockup (Desktop &amp; Mobile)</w:t>
@@ -3483,7 +3572,7 @@
           <w:lang w:eastAsia="en-US"/>
         </w:rPr>
         <w:pict w14:anchorId="1C6DC3FF">
-          <v:rect id="_x0000_i1058" style="width:0;height:1.5pt" o:hralign="center" o:hrstd="t" o:hr="t" fillcolor="#a0a0a0" stroked="f"/>
+          <v:rect id="_x0000_i1029" style="width:0;height:1.5pt" o:hralign="center" o:hrstd="t" o:hr="t" fillcolor="#a0a0a0" stroked="f"/>
         </w:pict>
       </w:r>
     </w:p>
@@ -4717,6 +4806,7 @@
                 <w:rFonts w:ascii="Times New Roman" w:eastAsia="Times New Roman" w:hAnsi="Times New Roman" w:cs="Times New Roman"/>
                 <w:lang w:eastAsia="en-US"/>
               </w:rPr>
+              <w:lastRenderedPageBreak/>
               <w:t>Search Results</w:t>
             </w:r>
           </w:p>
@@ -4879,7 +4969,6 @@
           <w:szCs w:val="27"/>
           <w:lang w:eastAsia="en-US"/>
         </w:rPr>
-        <w:lastRenderedPageBreak/>
         <w:t>Standardized Interface Terminology Usage</w:t>
       </w:r>
     </w:p>
@@ -4896,7 +4985,23 @@
           <w:rFonts w:ascii="Times New Roman" w:eastAsia="Times New Roman" w:hAnsi="Times New Roman" w:cs="Times New Roman"/>
           <w:lang w:eastAsia="en-US"/>
         </w:rPr>
-        <w:t>To maintain consistency and integration across all CareerBound design views, teams must use the standardized interface labels and terminology defined in this document throughout all deliverables. These standardized labels must be used consistently in:</w:t>
+        <w:t xml:space="preserve">To maintain consistency and integration across all </w:t>
+      </w:r>
+      <w:proofErr w:type="spellStart"/>
+      <w:r>
+        <w:rPr>
+          <w:rFonts w:ascii="Times New Roman" w:eastAsia="Times New Roman" w:hAnsi="Times New Roman" w:cs="Times New Roman"/>
+          <w:lang w:eastAsia="en-US"/>
+        </w:rPr>
+        <w:t>CareerBound</w:t>
+      </w:r>
+      <w:proofErr w:type="spellEnd"/>
+      <w:r>
+        <w:rPr>
+          <w:rFonts w:ascii="Times New Roman" w:eastAsia="Times New Roman" w:hAnsi="Times New Roman" w:cs="Times New Roman"/>
+          <w:lang w:eastAsia="en-US"/>
+        </w:rPr>
+        <w:t xml:space="preserve"> design views, teams must use the standardized interface labels and terminology defined in this document throughout all deliverables. These standardized labels must be used consistently in:</w:t>
       </w:r>
     </w:p>
     <w:p>

</xml_diff>

<commit_message>
Updated the Standard for the Design Information table's Elements row.
</commit_message>
<xml_diff>
--- a/01_Standards/Milestone_2_First_Dozen_Views/Design_Description_and_Layout_Standards.docx
+++ b/01_Standards/Milestone_2_First_Dozen_Views/Design_Description_and_Layout_Standards.docx
@@ -929,8 +929,8 @@
           <w:i/>
           <w:iCs/>
           <w:kern w:val="36"/>
-          <w:sz w:val="32"/>
-          <w:szCs w:val="32"/>
+          <w:sz w:val="28"/>
+          <w:szCs w:val="28"/>
           <w:lang w:eastAsia="en-US"/>
         </w:rPr>
       </w:pPr>
@@ -940,8 +940,8 @@
           <w:b/>
           <w:bCs/>
           <w:kern w:val="36"/>
-          <w:sz w:val="32"/>
-          <w:szCs w:val="32"/>
+          <w:sz w:val="28"/>
+          <w:szCs w:val="28"/>
           <w:lang w:eastAsia="en-US"/>
         </w:rPr>
         <w:t>2.4 Job Search Screen</w:t>
@@ -952,8 +952,8 @@
           <w:b/>
           <w:bCs/>
           <w:kern w:val="36"/>
-          <w:sz w:val="32"/>
-          <w:szCs w:val="32"/>
+          <w:sz w:val="28"/>
+          <w:szCs w:val="28"/>
           <w:lang w:eastAsia="en-US"/>
         </w:rPr>
         <w:t xml:space="preserve"> </w:t>
@@ -964,8 +964,8 @@
           <w:i/>
           <w:iCs/>
           <w:kern w:val="36"/>
-          <w:sz w:val="32"/>
-          <w:szCs w:val="32"/>
+          <w:sz w:val="28"/>
+          <w:szCs w:val="28"/>
           <w:lang w:eastAsia="en-US"/>
         </w:rPr>
         <w:t>(Arial Bold 1</w:t>
@@ -976,8 +976,8 @@
           <w:i/>
           <w:iCs/>
           <w:kern w:val="36"/>
-          <w:sz w:val="32"/>
-          <w:szCs w:val="32"/>
+          <w:sz w:val="28"/>
+          <w:szCs w:val="28"/>
           <w:lang w:eastAsia="en-US"/>
         </w:rPr>
         <w:t>4</w:t>
@@ -988,8 +988,8 @@
           <w:i/>
           <w:iCs/>
           <w:kern w:val="36"/>
-          <w:sz w:val="32"/>
-          <w:szCs w:val="32"/>
+          <w:sz w:val="28"/>
+          <w:szCs w:val="28"/>
           <w:lang w:eastAsia="en-US"/>
         </w:rPr>
         <w:t xml:space="preserve"> pt)</w:t>
@@ -2233,7 +2233,17 @@
     </w:p>
     <w:p>
       <w:pPr>
-        <w:spacing w:before="100" w:beforeAutospacing="1" w:line="240" w:lineRule="auto"/>
+        <w:rPr>
+          <w:rFonts w:eastAsia="Times New Roman"/>
+          <w:sz w:val="8"/>
+          <w:szCs w:val="8"/>
+          <w:lang w:eastAsia="en-US"/>
+        </w:rPr>
+      </w:pPr>
+    </w:p>
+    <w:p>
+      <w:pPr>
+        <w:spacing w:line="240" w:lineRule="auto"/>
         <w:outlineLvl w:val="0"/>
         <w:rPr>
           <w:rFonts w:ascii="Times New Roman" w:eastAsia="Times New Roman" w:hAnsi="Times New Roman" w:cs="Times New Roman"/>
@@ -2368,7 +2378,14 @@
         <w:t xml:space="preserve"> fields:</w:t>
       </w:r>
     </w:p>
-    <w:p/>
+    <w:p>
+      <w:pPr>
+        <w:rPr>
+          <w:sz w:val="8"/>
+          <w:szCs w:val="8"/>
+        </w:rPr>
+      </w:pPr>
+    </w:p>
     <w:tbl>
       <w:tblPr>
         <w:tblStyle w:val="GridTable4"/>
@@ -2682,6 +2699,7 @@
           <w:tcPr>
             <w:cnfStyle w:val="001000000000" w:firstRow="0" w:lastRow="0" w:firstColumn="1" w:lastColumn="0" w:oddVBand="0" w:evenVBand="0" w:oddHBand="0" w:evenHBand="0" w:firstRowFirstColumn="0" w:firstRowLastColumn="0" w:lastRowFirstColumn="0" w:lastRowLastColumn="0"/>
             <w:tcW w:w="3055" w:type="dxa"/>
+            <w:vMerge w:val="restart"/>
             <w:hideMark/>
           </w:tcPr>
           <w:p>
@@ -2724,7 +2742,7 @@
                 <w:sz w:val="22"/>
                 <w:lang w:eastAsia="en-US"/>
               </w:rPr>
-              <w:t>Important UI components, controls, or major sections shown on the screen.</w:t>
+              <w:t>Important UI components</w:t>
             </w:r>
           </w:p>
         </w:tc>
@@ -2734,7 +2752,7 @@
           <w:tcPr>
             <w:cnfStyle w:val="001000000000" w:firstRow="0" w:lastRow="0" w:firstColumn="1" w:lastColumn="0" w:oddVBand="0" w:evenVBand="0" w:oddHBand="0" w:evenHBand="0" w:firstRowFirstColumn="0" w:firstRowLastColumn="0" w:lastRowFirstColumn="0" w:lastRowLastColumn="0"/>
             <w:tcW w:w="3055" w:type="dxa"/>
-            <w:hideMark/>
+            <w:vMerge/>
           </w:tcPr>
           <w:p>
             <w:pPr>
@@ -2745,39 +2763,38 @@
                 <w:lang w:eastAsia="en-US"/>
               </w:rPr>
             </w:pPr>
-            <w:r>
+          </w:p>
+        </w:tc>
+        <w:tc>
+          <w:tcPr>
+            <w:tcW w:w="6295" w:type="dxa"/>
+            <w:shd w:val="clear" w:color="auto" w:fill="CCCCCC"/>
+          </w:tcPr>
+          <w:p>
+            <w:pPr>
+              <w:spacing w:line="240" w:lineRule="auto"/>
+              <w:cnfStyle w:val="000000000000" w:firstRow="0" w:lastRow="0" w:firstColumn="0" w:lastColumn="0" w:oddVBand="0" w:evenVBand="0" w:oddHBand="0" w:evenHBand="0" w:firstRowFirstColumn="0" w:firstRowLastColumn="0" w:lastRowFirstColumn="0" w:lastRowLastColumn="0"/>
               <w:rPr>
                 <w:rFonts w:ascii="Arial" w:eastAsia="Times New Roman" w:hAnsi="Arial" w:cs="Arial"/>
                 <w:sz w:val="22"/>
                 <w:lang w:eastAsia="en-US"/>
               </w:rPr>
-              <w:lastRenderedPageBreak/>
-              <w:t>Inputs</w:t>
-            </w:r>
-          </w:p>
-        </w:tc>
-        <w:tc>
-          <w:tcPr>
-            <w:tcW w:w="6295" w:type="dxa"/>
-            <w:hideMark/>
-          </w:tcPr>
-          <w:p>
-            <w:pPr>
-              <w:spacing w:line="240" w:lineRule="auto"/>
-              <w:cnfStyle w:val="000000000000" w:firstRow="0" w:lastRow="0" w:firstColumn="0" w:lastColumn="0" w:oddVBand="0" w:evenVBand="0" w:oddHBand="0" w:evenHBand="0" w:firstRowFirstColumn="0" w:firstRowLastColumn="0" w:lastRowFirstColumn="0" w:lastRowLastColumn="0"/>
-              <w:rPr>
-                <w:rFonts w:ascii="Times New Roman" w:eastAsia="Times New Roman" w:hAnsi="Times New Roman" w:cs="Times New Roman"/>
+            </w:pPr>
+            <w:r>
+              <w:rPr>
+                <w:rFonts w:ascii="Arial" w:eastAsia="Times New Roman" w:hAnsi="Arial" w:cs="Arial"/>
                 <w:sz w:val="22"/>
                 <w:lang w:eastAsia="en-US"/>
               </w:rPr>
-            </w:pPr>
-            <w:r>
-              <w:rPr>
-                <w:rFonts w:ascii="Times New Roman" w:eastAsia="Times New Roman" w:hAnsi="Times New Roman" w:cs="Times New Roman"/>
+              <w:t>Co</w:t>
+            </w:r>
+            <w:r>
+              <w:rPr>
+                <w:rFonts w:ascii="Arial" w:eastAsia="Times New Roman" w:hAnsi="Arial" w:cs="Arial"/>
                 <w:sz w:val="22"/>
                 <w:lang w:eastAsia="en-US"/>
               </w:rPr>
-              <w:t>Information entered or actions performed by the user.</w:t>
+              <w:t>ntrols</w:t>
             </w:r>
           </w:p>
         </w:tc>
@@ -2790,7 +2807,7 @@
           <w:tcPr>
             <w:cnfStyle w:val="001000000000" w:firstRow="0" w:lastRow="0" w:firstColumn="1" w:lastColumn="0" w:oddVBand="0" w:evenVBand="0" w:oddHBand="0" w:evenHBand="0" w:firstRowFirstColumn="0" w:firstRowLastColumn="0" w:lastRowFirstColumn="0" w:lastRowLastColumn="0"/>
             <w:tcW w:w="3055" w:type="dxa"/>
-            <w:hideMark/>
+            <w:vMerge/>
           </w:tcPr>
           <w:p>
             <w:pPr>
@@ -2801,38 +2818,37 @@
                 <w:lang w:eastAsia="en-US"/>
               </w:rPr>
             </w:pPr>
-            <w:r>
+          </w:p>
+        </w:tc>
+        <w:tc>
+          <w:tcPr>
+            <w:tcW w:w="6295" w:type="dxa"/>
+          </w:tcPr>
+          <w:p>
+            <w:pPr>
+              <w:spacing w:line="240" w:lineRule="auto"/>
+              <w:cnfStyle w:val="000000100000" w:firstRow="0" w:lastRow="0" w:firstColumn="0" w:lastColumn="0" w:oddVBand="0" w:evenVBand="0" w:oddHBand="1" w:evenHBand="0" w:firstRowFirstColumn="0" w:firstRowLastColumn="0" w:lastRowFirstColumn="0" w:lastRowLastColumn="0"/>
               <w:rPr>
                 <w:rFonts w:ascii="Arial" w:eastAsia="Times New Roman" w:hAnsi="Arial" w:cs="Arial"/>
                 <w:sz w:val="22"/>
                 <w:lang w:eastAsia="en-US"/>
               </w:rPr>
-              <w:t>Outputs</w:t>
-            </w:r>
-          </w:p>
-        </w:tc>
-        <w:tc>
-          <w:tcPr>
-            <w:tcW w:w="6295" w:type="dxa"/>
-            <w:hideMark/>
-          </w:tcPr>
-          <w:p>
-            <w:pPr>
-              <w:spacing w:line="240" w:lineRule="auto"/>
-              <w:cnfStyle w:val="000000100000" w:firstRow="0" w:lastRow="0" w:firstColumn="0" w:lastColumn="0" w:oddVBand="0" w:evenVBand="0" w:oddHBand="1" w:evenHBand="0" w:firstRowFirstColumn="0" w:firstRowLastColumn="0" w:lastRowFirstColumn="0" w:lastRowLastColumn="0"/>
-              <w:rPr>
-                <w:rFonts w:ascii="Times New Roman" w:eastAsia="Times New Roman" w:hAnsi="Times New Roman" w:cs="Times New Roman"/>
+            </w:pPr>
+            <w:r>
+              <w:rPr>
+                <w:rFonts w:ascii="Arial" w:eastAsia="Times New Roman" w:hAnsi="Arial" w:cs="Arial"/>
                 <w:sz w:val="22"/>
                 <w:lang w:eastAsia="en-US"/>
               </w:rPr>
-            </w:pPr>
-            <w:r>
-              <w:rPr>
-                <w:rFonts w:ascii="Times New Roman" w:eastAsia="Times New Roman" w:hAnsi="Times New Roman" w:cs="Times New Roman"/>
+              <w:t>O</w:t>
+            </w:r>
+            <w:r>
+              <w:rPr>
+                <w:rFonts w:ascii="Arial" w:eastAsia="Times New Roman" w:hAnsi="Arial" w:cs="Arial"/>
                 <w:sz w:val="22"/>
                 <w:lang w:eastAsia="en-US"/>
               </w:rPr>
-              <w:t>Information displayed or returned by the system.</w:t>
+              <w:t>r major sections shown on the screen.</w:t>
             </w:r>
           </w:p>
         </w:tc>
@@ -2859,7 +2875,7 @@
                 <w:sz w:val="22"/>
                 <w:lang w:eastAsia="en-US"/>
               </w:rPr>
-              <w:t>Navigation / References</w:t>
+              <w:t>Inputs</w:t>
             </w:r>
           </w:p>
         </w:tc>
@@ -2873,18 +2889,18 @@
               <w:spacing w:line="240" w:lineRule="auto"/>
               <w:cnfStyle w:val="000000000000" w:firstRow="0" w:lastRow="0" w:firstColumn="0" w:lastColumn="0" w:oddVBand="0" w:evenVBand="0" w:oddHBand="0" w:evenHBand="0" w:firstRowFirstColumn="0" w:firstRowLastColumn="0" w:lastRowFirstColumn="0" w:lastRowLastColumn="0"/>
               <w:rPr>
-                <w:rFonts w:ascii="Times New Roman" w:eastAsia="Times New Roman" w:hAnsi="Times New Roman" w:cs="Times New Roman"/>
+                <w:rFonts w:ascii="Arial" w:eastAsia="Times New Roman" w:hAnsi="Arial" w:cs="Arial"/>
                 <w:sz w:val="22"/>
                 <w:lang w:eastAsia="en-US"/>
               </w:rPr>
             </w:pPr>
             <w:r>
               <w:rPr>
-                <w:rFonts w:ascii="Times New Roman" w:eastAsia="Times New Roman" w:hAnsi="Times New Roman" w:cs="Times New Roman"/>
+                <w:rFonts w:ascii="Arial" w:eastAsia="Times New Roman" w:hAnsi="Arial" w:cs="Arial"/>
                 <w:sz w:val="22"/>
                 <w:lang w:eastAsia="en-US"/>
               </w:rPr>
-              <w:t>Related screens, destinations, or connected views within the system.</w:t>
+              <w:t>Information entered or actions performed by the user.</w:t>
             </w:r>
           </w:p>
         </w:tc>
@@ -2914,6 +2930,114 @@
                 <w:sz w:val="22"/>
                 <w:lang w:eastAsia="en-US"/>
               </w:rPr>
+              <w:lastRenderedPageBreak/>
+              <w:t>Outputs</w:t>
+            </w:r>
+          </w:p>
+        </w:tc>
+        <w:tc>
+          <w:tcPr>
+            <w:tcW w:w="6295" w:type="dxa"/>
+            <w:hideMark/>
+          </w:tcPr>
+          <w:p>
+            <w:pPr>
+              <w:spacing w:line="240" w:lineRule="auto"/>
+              <w:cnfStyle w:val="000000100000" w:firstRow="0" w:lastRow="0" w:firstColumn="0" w:lastColumn="0" w:oddVBand="0" w:evenVBand="0" w:oddHBand="1" w:evenHBand="0" w:firstRowFirstColumn="0" w:firstRowLastColumn="0" w:lastRowFirstColumn="0" w:lastRowLastColumn="0"/>
+              <w:rPr>
+                <w:rFonts w:ascii="Arial" w:eastAsia="Times New Roman" w:hAnsi="Arial" w:cs="Arial"/>
+                <w:sz w:val="22"/>
+                <w:lang w:eastAsia="en-US"/>
+              </w:rPr>
+            </w:pPr>
+            <w:r>
+              <w:rPr>
+                <w:rFonts w:ascii="Arial" w:eastAsia="Times New Roman" w:hAnsi="Arial" w:cs="Arial"/>
+                <w:sz w:val="22"/>
+                <w:lang w:eastAsia="en-US"/>
+              </w:rPr>
+              <w:t>Information displayed or returned by the system.</w:t>
+            </w:r>
+          </w:p>
+        </w:tc>
+      </w:tr>
+      <w:tr>
+        <w:tc>
+          <w:tcPr>
+            <w:cnfStyle w:val="001000000000" w:firstRow="0" w:lastRow="0" w:firstColumn="1" w:lastColumn="0" w:oddVBand="0" w:evenVBand="0" w:oddHBand="0" w:evenHBand="0" w:firstRowFirstColumn="0" w:firstRowLastColumn="0" w:lastRowFirstColumn="0" w:lastRowLastColumn="0"/>
+            <w:tcW w:w="3055" w:type="dxa"/>
+            <w:hideMark/>
+          </w:tcPr>
+          <w:p>
+            <w:pPr>
+              <w:spacing w:line="240" w:lineRule="auto"/>
+              <w:rPr>
+                <w:rFonts w:ascii="Arial" w:eastAsia="Times New Roman" w:hAnsi="Arial" w:cs="Arial"/>
+                <w:sz w:val="22"/>
+                <w:lang w:eastAsia="en-US"/>
+              </w:rPr>
+            </w:pPr>
+            <w:r>
+              <w:rPr>
+                <w:rFonts w:ascii="Arial" w:eastAsia="Times New Roman" w:hAnsi="Arial" w:cs="Arial"/>
+                <w:sz w:val="22"/>
+                <w:lang w:eastAsia="en-US"/>
+              </w:rPr>
+              <w:t>Navigation / References</w:t>
+            </w:r>
+          </w:p>
+        </w:tc>
+        <w:tc>
+          <w:tcPr>
+            <w:tcW w:w="6295" w:type="dxa"/>
+            <w:hideMark/>
+          </w:tcPr>
+          <w:p>
+            <w:pPr>
+              <w:spacing w:line="240" w:lineRule="auto"/>
+              <w:cnfStyle w:val="000000000000" w:firstRow="0" w:lastRow="0" w:firstColumn="0" w:lastColumn="0" w:oddVBand="0" w:evenVBand="0" w:oddHBand="0" w:evenHBand="0" w:firstRowFirstColumn="0" w:firstRowLastColumn="0" w:lastRowFirstColumn="0" w:lastRowLastColumn="0"/>
+              <w:rPr>
+                <w:rFonts w:ascii="Arial" w:eastAsia="Times New Roman" w:hAnsi="Arial" w:cs="Arial"/>
+                <w:sz w:val="22"/>
+                <w:lang w:eastAsia="en-US"/>
+              </w:rPr>
+            </w:pPr>
+            <w:r>
+              <w:rPr>
+                <w:rFonts w:ascii="Arial" w:eastAsia="Times New Roman" w:hAnsi="Arial" w:cs="Arial"/>
+                <w:sz w:val="22"/>
+                <w:lang w:eastAsia="en-US"/>
+              </w:rPr>
+              <w:t>Related screens, destinations, or connected views within the system.</w:t>
+            </w:r>
+          </w:p>
+        </w:tc>
+      </w:tr>
+      <w:tr>
+        <w:trPr>
+          <w:cnfStyle w:val="000000100000" w:firstRow="0" w:lastRow="0" w:firstColumn="0" w:lastColumn="0" w:oddVBand="0" w:evenVBand="0" w:oddHBand="1" w:evenHBand="0" w:firstRowFirstColumn="0" w:firstRowLastColumn="0" w:lastRowFirstColumn="0" w:lastRowLastColumn="0"/>
+        </w:trPr>
+        <w:tc>
+          <w:tcPr>
+            <w:cnfStyle w:val="001000000000" w:firstRow="0" w:lastRow="0" w:firstColumn="1" w:lastColumn="0" w:oddVBand="0" w:evenVBand="0" w:oddHBand="0" w:evenHBand="0" w:firstRowFirstColumn="0" w:firstRowLastColumn="0" w:lastRowFirstColumn="0" w:lastRowLastColumn="0"/>
+            <w:tcW w:w="3055" w:type="dxa"/>
+            <w:hideMark/>
+          </w:tcPr>
+          <w:p>
+            <w:pPr>
+              <w:spacing w:line="240" w:lineRule="auto"/>
+              <w:rPr>
+                <w:rFonts w:ascii="Arial" w:eastAsia="Times New Roman" w:hAnsi="Arial" w:cs="Arial"/>
+                <w:sz w:val="22"/>
+                <w:lang w:eastAsia="en-US"/>
+              </w:rPr>
+            </w:pPr>
+            <w:r>
+              <w:rPr>
+                <w:rFonts w:ascii="Arial" w:eastAsia="Times New Roman" w:hAnsi="Arial" w:cs="Arial"/>
+                <w:sz w:val="22"/>
+                <w:lang w:eastAsia="en-US"/>
+              </w:rPr>
               <w:t>Viewpoint</w:t>
             </w:r>
           </w:p>
@@ -2928,14 +3052,14 @@
               <w:spacing w:line="240" w:lineRule="auto"/>
               <w:cnfStyle w:val="000000100000" w:firstRow="0" w:lastRow="0" w:firstColumn="0" w:lastColumn="0" w:oddVBand="0" w:evenVBand="0" w:oddHBand="1" w:evenHBand="0" w:firstRowFirstColumn="0" w:firstRowLastColumn="0" w:lastRowFirstColumn="0" w:lastRowLastColumn="0"/>
               <w:rPr>
-                <w:rFonts w:ascii="Times New Roman" w:eastAsia="Times New Roman" w:hAnsi="Times New Roman" w:cs="Times New Roman"/>
+                <w:rFonts w:ascii="Arial" w:eastAsia="Times New Roman" w:hAnsi="Arial" w:cs="Arial"/>
                 <w:sz w:val="22"/>
                 <w:lang w:eastAsia="en-US"/>
               </w:rPr>
             </w:pPr>
             <w:r>
               <w:rPr>
-                <w:rFonts w:ascii="Times New Roman" w:eastAsia="Times New Roman" w:hAnsi="Times New Roman" w:cs="Times New Roman"/>
+                <w:rFonts w:ascii="Arial" w:eastAsia="Times New Roman" w:hAnsi="Arial" w:cs="Arial"/>
                 <w:sz w:val="22"/>
                 <w:lang w:eastAsia="en-US"/>
               </w:rPr>
@@ -3297,6 +3421,7 @@
           <w:tcPr>
             <w:cnfStyle w:val="001000000000" w:firstRow="0" w:lastRow="0" w:firstColumn="1" w:lastColumn="0" w:oddVBand="0" w:evenVBand="0" w:oddHBand="0" w:evenHBand="0" w:firstRowFirstColumn="0" w:firstRowLastColumn="0" w:lastRowFirstColumn="0" w:lastRowLastColumn="0"/>
             <w:tcW w:w="0" w:type="auto"/>
+            <w:vMerge w:val="restart"/>
             <w:hideMark/>
           </w:tcPr>
           <w:p>
@@ -3321,6 +3446,7 @@
         <w:tc>
           <w:tcPr>
             <w:tcW w:w="0" w:type="auto"/>
+            <w:shd w:val="clear" w:color="auto" w:fill="CCCCCC"/>
             <w:hideMark/>
           </w:tcPr>
           <w:p>
@@ -3339,7 +3465,213 @@
                 <w:sz w:val="22"/>
                 <w:lang w:eastAsia="en-US"/>
               </w:rPr>
-              <w:t>Search bar, filters, results list, pagination, save/apply buttons</w:t>
+              <w:t>Search bar</w:t>
+            </w:r>
+          </w:p>
+        </w:tc>
+      </w:tr>
+      <w:tr>
+        <w:tc>
+          <w:tcPr>
+            <w:cnfStyle w:val="001000000000" w:firstRow="0" w:lastRow="0" w:firstColumn="1" w:lastColumn="0" w:oddVBand="0" w:evenVBand="0" w:oddHBand="0" w:evenHBand="0" w:firstRowFirstColumn="0" w:firstRowLastColumn="0" w:lastRowFirstColumn="0" w:lastRowLastColumn="0"/>
+            <w:tcW w:w="0" w:type="auto"/>
+            <w:vMerge/>
+          </w:tcPr>
+          <w:p>
+            <w:pPr>
+              <w:spacing w:line="240" w:lineRule="auto"/>
+              <w:rPr>
+                <w:rFonts w:ascii="Arial" w:eastAsia="Times New Roman" w:hAnsi="Arial" w:cs="Arial"/>
+                <w:sz w:val="22"/>
+                <w:lang w:eastAsia="en-US"/>
+              </w:rPr>
+            </w:pPr>
+          </w:p>
+        </w:tc>
+        <w:tc>
+          <w:tcPr>
+            <w:tcW w:w="0" w:type="auto"/>
+            <w:shd w:val="clear" w:color="auto" w:fill="CCCCCC"/>
+          </w:tcPr>
+          <w:p>
+            <w:pPr>
+              <w:spacing w:line="240" w:lineRule="auto"/>
+              <w:cnfStyle w:val="000000000000" w:firstRow="0" w:lastRow="0" w:firstColumn="0" w:lastColumn="0" w:oddVBand="0" w:evenVBand="0" w:oddHBand="0" w:evenHBand="0" w:firstRowFirstColumn="0" w:firstRowLastColumn="0" w:lastRowFirstColumn="0" w:lastRowLastColumn="0"/>
+              <w:rPr>
+                <w:rFonts w:ascii="Arial" w:eastAsia="Times New Roman" w:hAnsi="Arial" w:cs="Arial"/>
+                <w:sz w:val="22"/>
+                <w:lang w:eastAsia="en-US"/>
+              </w:rPr>
+            </w:pPr>
+            <w:r>
+              <w:rPr>
+                <w:rFonts w:ascii="Arial" w:eastAsia="Times New Roman" w:hAnsi="Arial" w:cs="Arial"/>
+                <w:sz w:val="22"/>
+                <w:lang w:eastAsia="en-US"/>
+              </w:rPr>
+              <w:t>Filters</w:t>
+            </w:r>
+          </w:p>
+        </w:tc>
+      </w:tr>
+      <w:tr>
+        <w:trPr>
+          <w:cnfStyle w:val="000000100000" w:firstRow="0" w:lastRow="0" w:firstColumn="0" w:lastColumn="0" w:oddVBand="0" w:evenVBand="0" w:oddHBand="1" w:evenHBand="0" w:firstRowFirstColumn="0" w:firstRowLastColumn="0" w:lastRowFirstColumn="0" w:lastRowLastColumn="0"/>
+        </w:trPr>
+        <w:tc>
+          <w:tcPr>
+            <w:cnfStyle w:val="001000000000" w:firstRow="0" w:lastRow="0" w:firstColumn="1" w:lastColumn="0" w:oddVBand="0" w:evenVBand="0" w:oddHBand="0" w:evenHBand="0" w:firstRowFirstColumn="0" w:firstRowLastColumn="0" w:lastRowFirstColumn="0" w:lastRowLastColumn="0"/>
+            <w:tcW w:w="0" w:type="auto"/>
+            <w:vMerge/>
+          </w:tcPr>
+          <w:p>
+            <w:pPr>
+              <w:spacing w:line="240" w:lineRule="auto"/>
+              <w:rPr>
+                <w:rFonts w:ascii="Arial" w:eastAsia="Times New Roman" w:hAnsi="Arial" w:cs="Arial"/>
+                <w:sz w:val="22"/>
+                <w:lang w:eastAsia="en-US"/>
+              </w:rPr>
+            </w:pPr>
+          </w:p>
+        </w:tc>
+        <w:tc>
+          <w:tcPr>
+            <w:tcW w:w="0" w:type="auto"/>
+            <w:shd w:val="clear" w:color="auto" w:fill="CCCCCC"/>
+          </w:tcPr>
+          <w:p>
+            <w:pPr>
+              <w:spacing w:line="240" w:lineRule="auto"/>
+              <w:cnfStyle w:val="000000100000" w:firstRow="0" w:lastRow="0" w:firstColumn="0" w:lastColumn="0" w:oddVBand="0" w:evenVBand="0" w:oddHBand="1" w:evenHBand="0" w:firstRowFirstColumn="0" w:firstRowLastColumn="0" w:lastRowFirstColumn="0" w:lastRowLastColumn="0"/>
+              <w:rPr>
+                <w:rFonts w:ascii="Arial" w:eastAsia="Times New Roman" w:hAnsi="Arial" w:cs="Arial"/>
+                <w:sz w:val="22"/>
+                <w:lang w:eastAsia="en-US"/>
+              </w:rPr>
+            </w:pPr>
+            <w:r>
+              <w:rPr>
+                <w:rFonts w:ascii="Arial" w:eastAsia="Times New Roman" w:hAnsi="Arial" w:cs="Arial"/>
+                <w:sz w:val="22"/>
+                <w:lang w:eastAsia="en-US"/>
+              </w:rPr>
+              <w:t>R</w:t>
+            </w:r>
+            <w:r>
+              <w:rPr>
+                <w:rFonts w:ascii="Arial" w:eastAsia="Times New Roman" w:hAnsi="Arial" w:cs="Arial"/>
+                <w:sz w:val="22"/>
+                <w:lang w:eastAsia="en-US"/>
+              </w:rPr>
+              <w:t>esults list</w:t>
+            </w:r>
+          </w:p>
+        </w:tc>
+      </w:tr>
+      <w:tr>
+        <w:tc>
+          <w:tcPr>
+            <w:cnfStyle w:val="001000000000" w:firstRow="0" w:lastRow="0" w:firstColumn="1" w:lastColumn="0" w:oddVBand="0" w:evenVBand="0" w:oddHBand="0" w:evenHBand="0" w:firstRowFirstColumn="0" w:firstRowLastColumn="0" w:lastRowFirstColumn="0" w:lastRowLastColumn="0"/>
+            <w:tcW w:w="0" w:type="auto"/>
+            <w:vMerge/>
+          </w:tcPr>
+          <w:p>
+            <w:pPr>
+              <w:spacing w:line="240" w:lineRule="auto"/>
+              <w:rPr>
+                <w:rFonts w:ascii="Arial" w:eastAsia="Times New Roman" w:hAnsi="Arial" w:cs="Arial"/>
+                <w:sz w:val="22"/>
+                <w:lang w:eastAsia="en-US"/>
+              </w:rPr>
+            </w:pPr>
+          </w:p>
+        </w:tc>
+        <w:tc>
+          <w:tcPr>
+            <w:tcW w:w="0" w:type="auto"/>
+            <w:shd w:val="clear" w:color="auto" w:fill="CCCCCC"/>
+          </w:tcPr>
+          <w:p>
+            <w:pPr>
+              <w:spacing w:line="240" w:lineRule="auto"/>
+              <w:cnfStyle w:val="000000000000" w:firstRow="0" w:lastRow="0" w:firstColumn="0" w:lastColumn="0" w:oddVBand="0" w:evenVBand="0" w:oddHBand="0" w:evenHBand="0" w:firstRowFirstColumn="0" w:firstRowLastColumn="0" w:lastRowFirstColumn="0" w:lastRowLastColumn="0"/>
+              <w:rPr>
+                <w:rFonts w:ascii="Arial" w:eastAsia="Times New Roman" w:hAnsi="Arial" w:cs="Arial"/>
+                <w:sz w:val="22"/>
+                <w:lang w:eastAsia="en-US"/>
+              </w:rPr>
+            </w:pPr>
+            <w:r>
+              <w:rPr>
+                <w:rFonts w:ascii="Arial" w:eastAsia="Times New Roman" w:hAnsi="Arial" w:cs="Arial"/>
+                <w:sz w:val="22"/>
+                <w:lang w:eastAsia="en-US"/>
+              </w:rPr>
+              <w:t>P</w:t>
+            </w:r>
+            <w:r>
+              <w:rPr>
+                <w:rFonts w:ascii="Arial" w:eastAsia="Times New Roman" w:hAnsi="Arial" w:cs="Arial"/>
+                <w:sz w:val="22"/>
+                <w:lang w:eastAsia="en-US"/>
+              </w:rPr>
+              <w:t>agination</w:t>
+            </w:r>
+          </w:p>
+        </w:tc>
+      </w:tr>
+      <w:tr>
+        <w:trPr>
+          <w:cnfStyle w:val="000000100000" w:firstRow="0" w:lastRow="0" w:firstColumn="0" w:lastColumn="0" w:oddVBand="0" w:evenVBand="0" w:oddHBand="1" w:evenHBand="0" w:firstRowFirstColumn="0" w:firstRowLastColumn="0" w:lastRowFirstColumn="0" w:lastRowLastColumn="0"/>
+        </w:trPr>
+        <w:tc>
+          <w:tcPr>
+            <w:cnfStyle w:val="001000000000" w:firstRow="0" w:lastRow="0" w:firstColumn="1" w:lastColumn="0" w:oddVBand="0" w:evenVBand="0" w:oddHBand="0" w:evenHBand="0" w:firstRowFirstColumn="0" w:firstRowLastColumn="0" w:lastRowFirstColumn="0" w:lastRowLastColumn="0"/>
+            <w:tcW w:w="0" w:type="auto"/>
+            <w:vMerge/>
+          </w:tcPr>
+          <w:p>
+            <w:pPr>
+              <w:spacing w:line="240" w:lineRule="auto"/>
+              <w:rPr>
+                <w:rFonts w:ascii="Arial" w:eastAsia="Times New Roman" w:hAnsi="Arial" w:cs="Arial"/>
+                <w:sz w:val="22"/>
+                <w:lang w:eastAsia="en-US"/>
+              </w:rPr>
+            </w:pPr>
+          </w:p>
+        </w:tc>
+        <w:tc>
+          <w:tcPr>
+            <w:tcW w:w="0" w:type="auto"/>
+            <w:shd w:val="clear" w:color="auto" w:fill="CCCCCC"/>
+          </w:tcPr>
+          <w:p>
+            <w:pPr>
+              <w:spacing w:line="240" w:lineRule="auto"/>
+              <w:cnfStyle w:val="000000100000" w:firstRow="0" w:lastRow="0" w:firstColumn="0" w:lastColumn="0" w:oddVBand="0" w:evenVBand="0" w:oddHBand="1" w:evenHBand="0" w:firstRowFirstColumn="0" w:firstRowLastColumn="0" w:lastRowFirstColumn="0" w:lastRowLastColumn="0"/>
+              <w:rPr>
+                <w:rFonts w:ascii="Arial" w:eastAsia="Times New Roman" w:hAnsi="Arial" w:cs="Arial"/>
+                <w:sz w:val="22"/>
+                <w:lang w:eastAsia="en-US"/>
+              </w:rPr>
+            </w:pPr>
+            <w:r>
+              <w:rPr>
+                <w:rFonts w:ascii="Arial" w:eastAsia="Times New Roman" w:hAnsi="Arial" w:cs="Arial"/>
+                <w:sz w:val="22"/>
+                <w:lang w:eastAsia="en-US"/>
+              </w:rPr>
+              <w:t>S</w:t>
+            </w:r>
+            <w:r>
+              <w:rPr>
+                <w:rFonts w:ascii="Arial" w:eastAsia="Times New Roman" w:hAnsi="Arial" w:cs="Arial"/>
+                <w:sz w:val="22"/>
+                <w:lang w:eastAsia="en-US"/>
+              </w:rPr>
+              <w:t>ave/apply buttons</w:t>
             </w:r>
           </w:p>
         </w:tc>
@@ -4516,6 +4848,7 @@
                 <w:rFonts w:ascii="Times New Roman" w:eastAsia="Times New Roman" w:hAnsi="Times New Roman" w:cs="Times New Roman"/>
                 <w:lang w:eastAsia="en-US"/>
               </w:rPr>
+              <w:lastRenderedPageBreak/>
               <w:t>Authentication</w:t>
             </w:r>
           </w:p>
@@ -4806,7 +5139,6 @@
                 <w:rFonts w:ascii="Times New Roman" w:eastAsia="Times New Roman" w:hAnsi="Times New Roman" w:cs="Times New Roman"/>
                 <w:lang w:eastAsia="en-US"/>
               </w:rPr>
-              <w:lastRenderedPageBreak/>
               <w:t>Search Results</w:t>
             </w:r>
           </w:p>

</xml_diff>

<commit_message>
Added a Deliverable Example doc and made some clarifications in the layout standards doc
</commit_message>
<xml_diff>
--- a/01_Standards/Milestone_2_First_Dozen_Views/Design_Description_and_Layout_Standards.docx
+++ b/01_Standards/Milestone_2_First_Dozen_Views/Design_Description_and_Layout_Standards.docx
@@ -327,15 +327,7 @@
           <w:rFonts w:ascii="Times New Roman" w:eastAsia="Times New Roman" w:hAnsi="Times New Roman" w:cs="Times New Roman"/>
           <w:lang w:eastAsia="en-US"/>
         </w:rPr>
-        <w:t xml:space="preserve">3.1 Company </w:t>
-      </w:r>
-      <w:proofErr w:type="gramStart"/>
-      <w:r>
-        <w:rPr>
-          <w:rFonts w:ascii="Times New Roman" w:eastAsia="Times New Roman" w:hAnsi="Times New Roman" w:cs="Times New Roman"/>
-          <w:lang w:eastAsia="en-US"/>
-        </w:rPr>
-        <w:t xml:space="preserve">Dashboard </w:t>
+        <w:t xml:space="preserve">3.1 Company Dashboard </w:t>
       </w:r>
       <w:r>
         <w:rPr>
@@ -345,11 +337,7 @@
         <w:t xml:space="preserve"> </w:t>
       </w:r>
       <w:r>
-        <w:t>—</w:t>
-      </w:r>
-      <w:proofErr w:type="gramEnd"/>
-      <w:r>
-        <w:t xml:space="preserve"> Team 7 (Marco Quintero)</w:t>
+        <w:t>— Team 7 (Marco Quintero)</w:t>
       </w:r>
     </w:p>
     <w:p>
@@ -2002,23 +1990,7 @@
           <w:rFonts w:ascii="Times New Roman" w:eastAsia="Times New Roman" w:hAnsi="Times New Roman" w:cs="Times New Roman"/>
           <w:lang w:eastAsia="en-US"/>
         </w:rPr>
-        <w:t xml:space="preserve">Tables shall span the full document </w:t>
-      </w:r>
-      <w:proofErr w:type="gramStart"/>
-      <w:r>
-        <w:rPr>
-          <w:rFonts w:ascii="Times New Roman" w:eastAsia="Times New Roman" w:hAnsi="Times New Roman" w:cs="Times New Roman"/>
-          <w:lang w:eastAsia="en-US"/>
-        </w:rPr>
-        <w:t>text width</w:t>
-      </w:r>
-      <w:proofErr w:type="gramEnd"/>
-      <w:r>
-        <w:rPr>
-          <w:rFonts w:ascii="Times New Roman" w:eastAsia="Times New Roman" w:hAnsi="Times New Roman" w:cs="Times New Roman"/>
-          <w:lang w:eastAsia="en-US"/>
-        </w:rPr>
-        <w:t xml:space="preserve"> using </w:t>
+        <w:t xml:space="preserve">Tables shall span the full document text width using </w:t>
       </w:r>
       <w:r>
         <w:rPr>
@@ -2070,7 +2042,7 @@
           <w:rFonts w:ascii="Times New Roman" w:eastAsia="Times New Roman" w:hAnsi="Times New Roman" w:cs="Times New Roman"/>
           <w:lang w:eastAsia="en-US"/>
         </w:rPr>
-        <w:t xml:space="preserve">Standard document margins shall remain at 1 inch. </w:t>
+        <w:t>For header row "Repeat as header row at the top of each page"</w:t>
       </w:r>
     </w:p>
     <w:p>
@@ -2090,7 +2062,7 @@
           <w:rFonts w:ascii="Times New Roman" w:eastAsia="Times New Roman" w:hAnsi="Times New Roman" w:cs="Times New Roman"/>
           <w:lang w:eastAsia="en-US"/>
         </w:rPr>
-        <w:t xml:space="preserve">Table header rows shall use Arial Bold 12 pt formatting. </w:t>
+        <w:t>Elements row has each element as a separate line</w:t>
       </w:r>
     </w:p>
     <w:p>
@@ -2110,7 +2082,7 @@
           <w:rFonts w:ascii="Times New Roman" w:eastAsia="Times New Roman" w:hAnsi="Times New Roman" w:cs="Times New Roman"/>
           <w:lang w:eastAsia="en-US"/>
         </w:rPr>
-        <w:t xml:space="preserve">First-column field labels shall use Arial Bold 10 pt formatting. </w:t>
+        <w:t xml:space="preserve">Standard document margins shall remain at 1 inch. </w:t>
       </w:r>
     </w:p>
     <w:p>
@@ -2130,11 +2102,79 @@
           <w:rFonts w:ascii="Times New Roman" w:eastAsia="Times New Roman" w:hAnsi="Times New Roman" w:cs="Times New Roman"/>
           <w:lang w:eastAsia="en-US"/>
         </w:rPr>
-        <w:t>Table content/descriptions shall use Arial 10 pt formatting.</w:t>
+        <w:t xml:space="preserve">Table header rows shall use Arial Bold 12 pt formatting. </w:t>
       </w:r>
     </w:p>
     <w:p>
       <w:pPr>
+        <w:numPr>
+          <w:ilvl w:val="0"/>
+          <w:numId w:val="13"/>
+        </w:numPr>
+        <w:spacing w:line="240" w:lineRule="auto"/>
+        <w:rPr>
+          <w:rFonts w:ascii="Times New Roman" w:eastAsia="Times New Roman" w:hAnsi="Times New Roman" w:cs="Times New Roman"/>
+          <w:lang w:eastAsia="en-US"/>
+        </w:rPr>
+      </w:pPr>
+      <w:r>
+        <w:rPr>
+          <w:rFonts w:ascii="Times New Roman" w:eastAsia="Times New Roman" w:hAnsi="Times New Roman" w:cs="Times New Roman"/>
+          <w:lang w:eastAsia="en-US"/>
+        </w:rPr>
+        <w:t>First-column field labels shall use Arial Bold 1</w:t>
+      </w:r>
+      <w:r>
+        <w:rPr>
+          <w:rFonts w:ascii="Times New Roman" w:eastAsia="Times New Roman" w:hAnsi="Times New Roman" w:cs="Times New Roman"/>
+          <w:lang w:eastAsia="en-US"/>
+        </w:rPr>
+        <w:t>1</w:t>
+      </w:r>
+      <w:r>
+        <w:rPr>
+          <w:rFonts w:ascii="Times New Roman" w:eastAsia="Times New Roman" w:hAnsi="Times New Roman" w:cs="Times New Roman"/>
+          <w:lang w:eastAsia="en-US"/>
+        </w:rPr>
+        <w:t xml:space="preserve"> pt formatting. </w:t>
+      </w:r>
+    </w:p>
+    <w:p>
+      <w:pPr>
+        <w:numPr>
+          <w:ilvl w:val="0"/>
+          <w:numId w:val="13"/>
+        </w:numPr>
+        <w:spacing w:line="240" w:lineRule="auto"/>
+        <w:rPr>
+          <w:rFonts w:ascii="Times New Roman" w:eastAsia="Times New Roman" w:hAnsi="Times New Roman" w:cs="Times New Roman"/>
+          <w:lang w:eastAsia="en-US"/>
+        </w:rPr>
+      </w:pPr>
+      <w:r>
+        <w:rPr>
+          <w:rFonts w:ascii="Times New Roman" w:eastAsia="Times New Roman" w:hAnsi="Times New Roman" w:cs="Times New Roman"/>
+          <w:lang w:eastAsia="en-US"/>
+        </w:rPr>
+        <w:t>Table content/descriptions shall use Arial 1</w:t>
+      </w:r>
+      <w:r>
+        <w:rPr>
+          <w:rFonts w:ascii="Times New Roman" w:eastAsia="Times New Roman" w:hAnsi="Times New Roman" w:cs="Times New Roman"/>
+          <w:lang w:eastAsia="en-US"/>
+        </w:rPr>
+        <w:t>1</w:t>
+      </w:r>
+      <w:r>
+        <w:rPr>
+          <w:rFonts w:ascii="Times New Roman" w:eastAsia="Times New Roman" w:hAnsi="Times New Roman" w:cs="Times New Roman"/>
+          <w:lang w:eastAsia="en-US"/>
+        </w:rPr>
+        <w:t xml:space="preserve"> pt formatting.</w:t>
+      </w:r>
+    </w:p>
+    <w:p>
+      <w:pPr>
         <w:spacing w:before="240" w:line="240" w:lineRule="auto"/>
         <w:jc w:val="center"/>
         <w:rPr>
@@ -2147,9 +2187,9 @@
           <w:noProof/>
         </w:rPr>
         <w:drawing>
-          <wp:inline distT="0" distB="0" distL="0" distR="0" wp14:anchorId="640B12F7" wp14:editId="31D806C0">
-            <wp:extent cx="3914775" cy="1057275"/>
-            <wp:effectExtent l="133350" t="114300" r="142875" b="142875"/>
+          <wp:inline distT="0" distB="0" distL="0" distR="0" wp14:anchorId="640B12F7" wp14:editId="790BF17C">
+            <wp:extent cx="2514600" cy="679126"/>
+            <wp:effectExtent l="133350" t="114300" r="152400" b="140335"/>
             <wp:docPr id="1791756266" name="Picture 1"/>
             <wp:cNvGraphicFramePr>
               <a:graphicFrameLocks xmlns:a="http://schemas.openxmlformats.org/drawingml/2006/main" noChangeAspect="1"/>
@@ -2170,7 +2210,7 @@
                   <pic:spPr>
                     <a:xfrm>
                       <a:off x="0" y="0"/>
-                      <a:ext cx="3914775" cy="1057275"/>
+                      <a:ext cx="2538493" cy="685579"/>
                     </a:xfrm>
                     <a:prstGeom prst="rect">
                       <a:avLst/>
@@ -2212,6 +2252,76 @@
           </wp:inline>
         </w:drawing>
       </w:r>
+      <w:r>
+        <w:rPr>
+          <w:noProof/>
+        </w:rPr>
+        <w:drawing>
+          <wp:inline distT="0" distB="0" distL="0" distR="0" wp14:anchorId="366E7CEF" wp14:editId="02B18157">
+            <wp:extent cx="1990725" cy="1007297"/>
+            <wp:effectExtent l="133350" t="114300" r="142875" b="154940"/>
+            <wp:docPr id="34672109" name="Picture 1"/>
+            <wp:cNvGraphicFramePr>
+              <a:graphicFrameLocks xmlns:a="http://schemas.openxmlformats.org/drawingml/2006/main" noChangeAspect="1"/>
+            </wp:cNvGraphicFramePr>
+            <a:graphic xmlns:a="http://schemas.openxmlformats.org/drawingml/2006/main">
+              <a:graphicData uri="http://schemas.openxmlformats.org/drawingml/2006/picture">
+                <pic:pic xmlns:pic="http://schemas.openxmlformats.org/drawingml/2006/picture">
+                  <pic:nvPicPr>
+                    <pic:cNvPr id="34672109" name=""/>
+                    <pic:cNvPicPr/>
+                  </pic:nvPicPr>
+                  <pic:blipFill>
+                    <a:blip r:embed="rId6"/>
+                    <a:stretch>
+                      <a:fillRect/>
+                    </a:stretch>
+                  </pic:blipFill>
+                  <pic:spPr>
+                    <a:xfrm>
+                      <a:off x="0" y="0"/>
+                      <a:ext cx="1997752" cy="1010853"/>
+                    </a:xfrm>
+                    <a:prstGeom prst="rect">
+                      <a:avLst/>
+                    </a:prstGeom>
+                    <a:solidFill>
+                      <a:srgbClr val="FFFFFF">
+                        <a:shade val="85000"/>
+                      </a:srgbClr>
+                    </a:solidFill>
+                    <a:ln w="88900" cap="sq">
+                      <a:solidFill>
+                        <a:srgbClr val="FFFFFF"/>
+                      </a:solidFill>
+                      <a:miter lim="800000"/>
+                    </a:ln>
+                    <a:effectLst>
+                      <a:outerShdw blurRad="55000" dist="18000" dir="5400000" algn="tl" rotWithShape="0">
+                        <a:srgbClr val="000000">
+                          <a:alpha val="40000"/>
+                        </a:srgbClr>
+                      </a:outerShdw>
+                    </a:effectLst>
+                    <a:scene3d>
+                      <a:camera prst="orthographicFront"/>
+                      <a:lightRig rig="twoPt" dir="t">
+                        <a:rot lat="0" lon="0" rev="7200000"/>
+                      </a:lightRig>
+                    </a:scene3d>
+                    <a:sp3d>
+                      <a:bevelT w="25400" h="19050"/>
+                      <a:contourClr>
+                        <a:srgbClr val="FFFFFF"/>
+                      </a:contourClr>
+                    </a:sp3d>
+                  </pic:spPr>
+                </pic:pic>
+              </a:graphicData>
+            </a:graphic>
+          </wp:inline>
+        </w:drawing>
+      </w:r>
     </w:p>
     <w:p>
       <w:pPr>
@@ -2399,6 +2509,7 @@
       <w:tr>
         <w:trPr>
           <w:cnfStyle w:val="100000000000" w:firstRow="1" w:lastRow="0" w:firstColumn="0" w:lastColumn="0" w:oddVBand="0" w:evenVBand="0" w:oddHBand="0" w:evenHBand="0" w:firstRowFirstColumn="0" w:firstRowLastColumn="0" w:lastRowFirstColumn="0" w:lastRowLastColumn="0"/>
+          <w:tblHeader/>
         </w:trPr>
         <w:tc>
           <w:tcPr>
@@ -2545,41 +2656,13 @@
                 <w:lang w:eastAsia="en-US"/>
               </w:rPr>
             </w:pPr>
-            <w:proofErr w:type="gramStart"/>
             <w:r>
               <w:rPr>
                 <w:rFonts w:ascii="Arial" w:eastAsia="Times New Roman" w:hAnsi="Arial" w:cs="Arial"/>
                 <w:sz w:val="22"/>
                 <w:lang w:eastAsia="en-US"/>
               </w:rPr>
-              <w:t>Explains</w:t>
-            </w:r>
-            <w:proofErr w:type="gramEnd"/>
-            <w:r>
-              <w:rPr>
-                <w:rFonts w:ascii="Arial" w:eastAsia="Times New Roman" w:hAnsi="Arial" w:cs="Arial"/>
-                <w:sz w:val="22"/>
-                <w:lang w:eastAsia="en-US"/>
-              </w:rPr>
-              <w:t xml:space="preserve"> why the screen exists and what stakeholder or user </w:t>
-            </w:r>
-            <w:proofErr w:type="gramStart"/>
-            <w:r>
-              <w:rPr>
-                <w:rFonts w:ascii="Arial" w:eastAsia="Times New Roman" w:hAnsi="Arial" w:cs="Arial"/>
-                <w:sz w:val="22"/>
-                <w:lang w:eastAsia="en-US"/>
-              </w:rPr>
-              <w:t>concern</w:t>
-            </w:r>
-            <w:proofErr w:type="gramEnd"/>
-            <w:r>
-              <w:rPr>
-                <w:rFonts w:ascii="Arial" w:eastAsia="Times New Roman" w:hAnsi="Arial" w:cs="Arial"/>
-                <w:sz w:val="22"/>
-                <w:lang w:eastAsia="en-US"/>
-              </w:rPr>
-              <w:t xml:space="preserve"> it addresses.</w:t>
+              <w:t>Explains why the screen exists and what stakeholder or user concern it addresses.</w:t>
             </w:r>
           </w:p>
         </w:tc>
@@ -2930,7 +3013,6 @@
                 <w:sz w:val="22"/>
                 <w:lang w:eastAsia="en-US"/>
               </w:rPr>
-              <w:lastRenderedPageBreak/>
               <w:t>Outputs</w:t>
             </w:r>
           </w:p>
@@ -3285,23 +3367,13 @@
                 <w:lang w:eastAsia="en-US"/>
               </w:rPr>
             </w:pPr>
-            <w:proofErr w:type="gramStart"/>
             <w:r>
               <w:rPr>
                 <w:rFonts w:ascii="Arial" w:eastAsia="Times New Roman" w:hAnsi="Arial" w:cs="Arial"/>
                 <w:sz w:val="22"/>
                 <w:lang w:eastAsia="en-US"/>
               </w:rPr>
-              <w:t>Allows</w:t>
-            </w:r>
-            <w:proofErr w:type="gramEnd"/>
-            <w:r>
-              <w:rPr>
-                <w:rFonts w:ascii="Arial" w:eastAsia="Times New Roman" w:hAnsi="Arial" w:cs="Arial"/>
-                <w:sz w:val="22"/>
-                <w:lang w:eastAsia="en-US"/>
-              </w:rPr>
-              <w:t xml:space="preserve"> students to search for jobs and companies.</w:t>
+              <w:t>Allows students to search for jobs and companies.</w:t>
             </w:r>
           </w:p>
         </w:tc>
@@ -4632,6 +4704,7 @@
                 <w:rFonts w:ascii="Times New Roman" w:eastAsia="Times New Roman" w:hAnsi="Times New Roman" w:cs="Times New Roman"/>
                 <w:lang w:eastAsia="en-US"/>
               </w:rPr>
+              <w:lastRenderedPageBreak/>
               <w:t>Job Management</w:t>
             </w:r>
           </w:p>
@@ -4848,7 +4921,6 @@
                 <w:rFonts w:ascii="Times New Roman" w:eastAsia="Times New Roman" w:hAnsi="Times New Roman" w:cs="Times New Roman"/>
                 <w:lang w:eastAsia="en-US"/>
               </w:rPr>
-              <w:lastRenderedPageBreak/>
               <w:t>Authentication</w:t>
             </w:r>
           </w:p>
@@ -5317,23 +5389,7 @@
           <w:rFonts w:ascii="Times New Roman" w:eastAsia="Times New Roman" w:hAnsi="Times New Roman" w:cs="Times New Roman"/>
           <w:lang w:eastAsia="en-US"/>
         </w:rPr>
-        <w:t xml:space="preserve">To maintain consistency and integration across all </w:t>
-      </w:r>
-      <w:proofErr w:type="spellStart"/>
-      <w:r>
-        <w:rPr>
-          <w:rFonts w:ascii="Times New Roman" w:eastAsia="Times New Roman" w:hAnsi="Times New Roman" w:cs="Times New Roman"/>
-          <w:lang w:eastAsia="en-US"/>
-        </w:rPr>
-        <w:t>CareerBound</w:t>
-      </w:r>
-      <w:proofErr w:type="spellEnd"/>
-      <w:r>
-        <w:rPr>
-          <w:rFonts w:ascii="Times New Roman" w:eastAsia="Times New Roman" w:hAnsi="Times New Roman" w:cs="Times New Roman"/>
-          <w:lang w:eastAsia="en-US"/>
-        </w:rPr>
-        <w:t xml:space="preserve"> design views, teams must use the standardized interface labels and terminology defined in this document throughout all deliverables. These standardized labels must be used consistently in:</w:t>
+        <w:t>To maintain consistency and integration across all CareerBound design views, teams must use the standardized interface labels and terminology defined in this document throughout all deliverables. These standardized labels must be used consistently in:</w:t>
       </w:r>
     </w:p>
     <w:p>

</xml_diff>